<commit_message>
Clean version: remove technical algorithm names, shorten Word doc, update timeline to 12-16 weeks
</commit_message>
<xml_diff>
--- a/BBA_Aerosmart_Proposal.docx
+++ b/BBA_Aerosmart_Proposal.docx
@@ -2,6 +2,7 @@
 <file path=word/document.xml><?xml version="1.0" encoding="utf-8"?>
 <w:document xmlns:wpc="http://schemas.microsoft.com/office/word/2010/wordprocessingCanvas" xmlns:mo="http://schemas.microsoft.com/office/mac/office/2008/main" xmlns:mc="http://schemas.openxmlformats.org/markup-compatibility/2006" xmlns:mv="urn:schemas-microsoft-com:mac:vml" xmlns:o="urn:schemas-microsoft-com:office:office" xmlns:r="http://schemas.openxmlformats.org/officeDocument/2006/relationships" xmlns:m="http://schemas.openxmlformats.org/officeDocument/2006/math" xmlns:v="urn:schemas-microsoft-com:vml" xmlns:wp14="http://schemas.microsoft.com/office/word/2010/wordprocessingDrawing" xmlns:wp="http://schemas.openxmlformats.org/drawingml/2006/wordprocessingDrawing" xmlns:w10="urn:schemas-microsoft-com:office:word" xmlns:w="http://schemas.openxmlformats.org/wordprocessingml/2006/main" xmlns:w14="http://schemas.microsoft.com/office/word/2010/wordml" xmlns:wpg="http://schemas.microsoft.com/office/word/2010/wordprocessingGroup" xmlns:wpi="http://schemas.microsoft.com/office/word/2010/wordprocessingInk" xmlns:wne="http://schemas.microsoft.com/office/word/2006/wordml" xmlns:wps="http://schemas.microsoft.com/office/word/2010/wordprocessingShape" mc:Ignorable="w14 wp14">
   <w:body>
+    <w:p/>
     <w:p/>
     <w:p/>
     <w:p/>
@@ -28,11 +29,12 @@
       <w:r>
         <w:rPr>
           <w:color w:val="666666"/>
-          <w:sz w:val="28"/>
+          <w:sz w:val="26"/>
         </w:rPr>
-        <w:t>Drone AI &amp; Computer Vision Solutions</w:t>
+        <w:t>Drone AI &amp; Computer Vision</w:t>
       </w:r>
     </w:p>
+    <w:p/>
     <w:p/>
     <w:p>
       <w:pPr>
@@ -44,7 +46,7 @@
           <w:color w:val="1A1A1A"/>
           <w:sz w:val="40"/>
         </w:rPr>
-        <w:t>AEROSMART COASTAL MONITORING PROJECT</w:t>
+        <w:t>Aerosmart Coastal Monitoring Project</w:t>
       </w:r>
     </w:p>
     <w:p>
@@ -54,11 +56,13 @@
       <w:r>
         <w:rPr>
           <w:color w:val="666666"/>
-          <w:sz w:val="28"/>
+          <w:sz w:val="24"/>
         </w:rPr>
         <w:t>AI Algorithm Development &amp; Flight Hub 2 Integration</w:t>
       </w:r>
     </w:p>
+    <w:p/>
+    <w:p/>
     <w:p/>
     <w:p/>
     <w:p/>
@@ -70,19 +74,7 @@
       <w:r>
         <w:rPr>
           <w:color w:val="666666"/>
-          <w:sz w:val="24"/>
-        </w:rPr>
-        <w:t>Technical Proposal</w:t>
-      </w:r>
-    </w:p>
-    <w:p>
-      <w:pPr>
-        <w:jc w:val="center"/>
-      </w:pPr>
-      <w:r>
-        <w:rPr>
-          <w:color w:val="666666"/>
-          <w:sz w:val="22"/>
+          <w:sz w:val="20"/>
         </w:rPr>
         <w:t>March 2026 | CONFIDENTIAL</w:t>
       </w:r>
@@ -112,17 +104,17 @@
         <w:rPr>
           <w:color w:val="1A1A1A"/>
         </w:rPr>
-        <w:t>1. Executive Summary</w:t>
+        <w:t>Overview</w:t>
       </w:r>
     </w:p>
     <w:p>
       <w:r>
-        <w:t>BBA Teknoloji, Aerosmart'in DJI Flight Hub 2 (on-premises) + Dock 3 altyapisi uzerine ozellestirilmis AI algoritmalari gelistirmeyi ve Dell Pro Max Tower T2 uzerinde inference sunucusu olarak deploy etmeyi teklif etmektedir.</w:t>
+        <w:t>BBA Teknoloji, Aerosmart'in Flight Hub 2 (on-premises) + Dock 3 altyapisi uzerine AI algoritmalari gelistirmeyi ve Dell T2 uzerinde deploy etmeyi teklif etmektedir.</w:t>
       </w:r>
     </w:p>
     <w:p>
       <w:r>
-        <w:t>Yaptığımız teknik arastirmada, DJI Flight Hub 2'nin Cloud Algorithm arayuzunun ucuncu parti algoritmalara acik oldugunu tespit ettik. Bu sayede BBA'nin gelistirdigi AI algoritmalari dogrudan Flight Hub 2 platformuna entegre edilebilir ve sonuclar FH2 dashboard'unda gercek zamanli olarak goruntulenir.</w:t>
+        <w:t>Flight Hub 2'nin Cloud Algorithm arayuzunun ucuncu parti algoritmalara acik oldugunu tespit ettik. BBA algoritmalari dogrudan FH2 platformuna entegre edilebilir.</w:t>
       </w:r>
     </w:p>
     <w:p>
@@ -133,39 +125,19 @@
         <w:t xml:space="preserve">Kapsam: </w:t>
       </w:r>
       <w:r>
-        <w:t>BBA'nin sorumlulugu yalnizca AI algoritma gelistirme, entegrasyon ve deployment ile sinirlidir. Ucus planlamasi, drone operasyonu ve Dock 3 kontrolu tamamen Aerosmart tarafinda kalacaktir.</w:t>
+        <w:t>Yalnizca AI algoritma gelistirme ve deployment. Ucus operasyonu Aerosmart'ta kalir.</w:t>
       </w:r>
     </w:p>
     <w:p>
       <w:r>
         <w:rPr>
           <w:b/>
-        </w:rPr>
-        <w:t xml:space="preserve">Toplam Proje Suresi: </w:t>
-      </w:r>
-      <w:r>
-        <w:rPr>
-          <w:b/>
           <w:color w:val="B8922F"/>
         </w:rPr>
-        <w:t>12-16 hafta (3-4 ay)</w:t>
+        <w:t>Tahmini sure: 12-16 hafta | Ilk teslimat: 6. hafta</w:t>
       </w:r>
     </w:p>
-    <w:p>
-      <w:r>
-        <w:rPr>
-          <w:b/>
-        </w:rPr>
-        <w:t xml:space="preserve">Ilk Calisir Teslimat: </w:t>
-      </w:r>
-      <w:r>
-        <w:rPr>
-          <w:b/>
-          <w:color w:val="2D8A4E"/>
-        </w:rPr>
-        <w:t>6 hafta</w:t>
-      </w:r>
-    </w:p>
+    <w:p/>
     <w:p>
       <w:pPr>
         <w:pStyle w:val="Heading1"/>
@@ -174,107 +146,7 @@
         <w:rPr>
           <w:color w:val="1A1A1A"/>
         </w:rPr>
-        <w:t>2. Flight Hub 2 Entegrasyon Yontemi</w:t>
-      </w:r>
-    </w:p>
-    <w:p>
-      <w:r>
-        <w:t>DJI Flight Hub 2, ucuncu parti algoritmalari iki yontemle desteklemektedir: Onboard Algorithm (drone cipi uzerinde) ve Cloud Algorithm (harici sunucu uzerinde). BBA icin Cloud Algorithm yontemi uygundur.</w:t>
-      </w:r>
-    </w:p>
-    <w:p>
-      <w:pPr>
-        <w:pStyle w:val="Heading2"/>
-      </w:pPr>
-      <w:r>
-        <w:rPr>
-          <w:color w:val="B8922F"/>
-        </w:rPr>
-        <w:t>Calisma Akisi</w:t>
-      </w:r>
-    </w:p>
-    <w:p>
-      <w:r>
-        <w:t>1. Aerosmart, Flight Hub 2 uzerinden patrol mission'lari planlar ve ucuslari yonetir.</w:t>
-      </w:r>
-    </w:p>
-    <w:p>
-      <w:r>
-        <w:t>2. Drone goruntusu (video stream) BBA inference sunucusuna yonlendirilir.</w:t>
-      </w:r>
-    </w:p>
-    <w:p>
-      <w:r>
-        <w:t>3. BBA sunucusu her frame'i gercek zamanli analiz eder.</w:t>
-      </w:r>
-    </w:p>
-    <w:p>
-      <w:r>
-        <w:t>4. Tespit sonuclari Flight Hub 2 dashboard'unda goruntulenir ve alert tetiklenir.</w:t>
-      </w:r>
-    </w:p>
-    <w:p>
-      <w:pPr>
-        <w:pStyle w:val="Heading2"/>
-      </w:pPr>
-      <w:r>
-        <w:rPr>
-          <w:color w:val="B8922F"/>
-        </w:rPr>
-        <w:t>Iki Entegrasyon Secenegi</w:t>
-      </w:r>
-    </w:p>
-    <w:p>
-      <w:r>
-        <w:rPr>
-          <w:b/>
-        </w:rPr>
-        <w:t xml:space="preserve">Secenek A - FH2 Cloud Algorithm: </w:t>
-      </w:r>
-      <w:r>
-        <w:t>Video stream FH2 uzerinden gelir, sonuclar dogrudan FH2 dashboard'unda goruntulenir.</w:t>
-      </w:r>
-    </w:p>
-    <w:p>
-      <w:r>
-        <w:rPr>
-          <w:b/>
-        </w:rPr>
-        <w:t xml:space="preserve">Secenek B - Bagimsiz BBA Dashboard: </w:t>
-      </w:r>
-      <w:r>
-        <w:t>Video stream RTMP/RTSP ile alinir, sonuclar BBA'nin kendi web dashboard'unda sunulur. Bu yontem ek olarak lokal sabit kameralari da ayni sisteme entegre etme imkani saglar.</w:t>
-      </w:r>
-    </w:p>
-    <w:p>
-      <w:pPr>
-        <w:pStyle w:val="Heading1"/>
-      </w:pPr>
-      <w:r>
-        <w:rPr>
-          <w:color w:val="1A1A1A"/>
-        </w:rPr>
-        <w:t>3. Use Case Bazli Yapilabilirlik</w:t>
-      </w:r>
-    </w:p>
-    <w:p>
-      <w:pPr>
-        <w:pStyle w:val="Heading2"/>
-      </w:pPr>
-      <w:r>
-        <w:rPr>
-          <w:color w:val="B8922F"/>
-        </w:rPr>
-        <w:t>Faz 1 - Temel Algilama &amp; Sayim (Hafta 1-6)</w:t>
-      </w:r>
-    </w:p>
-    <w:p>
-      <w:r>
-        <w:rPr>
-          <w:b/>
-          <w:color w:val="2D8A4E"/>
-        </w:rPr>
-        <w:t>Durum: PRODUCTION READY</w:t>
+        <w:t>Sunabilecegimiz Cozumler</w:t>
       </w:r>
     </w:p>
     <w:tbl>
@@ -285,14 +157,13 @@
         <w:tblLook w:firstColumn="1" w:firstRow="1" w:lastColumn="0" w:lastRow="0" w:noHBand="0" w:noVBand="1" w:val="04A0"/>
       </w:tblPr>
       <w:tblGrid>
-        <w:gridCol w:w="3135"/>
-        <w:gridCol w:w="3135"/>
-        <w:gridCol w:w="3135"/>
+        <w:gridCol w:w="4703"/>
+        <w:gridCol w:w="4703"/>
       </w:tblGrid>
       <w:tr>
         <w:tc>
           <w:tcPr>
-            <w:tcW w:type="dxa" w:w="3135"/>
+            <w:tcW w:type="dxa" w:w="4703"/>
             <w:shd w:fill="1A1A2A" w:val="clear"/>
           </w:tcPr>
           <w:p>
@@ -309,7 +180,7 @@
         </w:tc>
         <w:tc>
           <w:tcPr>
-            <w:tcW w:type="dxa" w:w="3135"/>
+            <w:tcW w:type="dxa" w:w="4703"/>
             <w:shd w:fill="1A1A2A" w:val="clear"/>
           </w:tcPr>
           <w:p>
@@ -320,24 +191,7 @@
                 <w:color w:val="FFFFFF"/>
                 <w:sz w:val="20"/>
               </w:rPr>
-              <w:t>Yontem</w:t>
-            </w:r>
-          </w:p>
-        </w:tc>
-        <w:tc>
-          <w:tcPr>
-            <w:tcW w:type="dxa" w:w="3135"/>
-            <w:shd w:fill="1A1A2A" w:val="clear"/>
-          </w:tcPr>
-          <w:p>
-            <w:r/>
-            <w:r>
-              <w:rPr>
-                <w:b/>
-                <w:color w:val="FFFFFF"/>
-                <w:sz w:val="20"/>
-              </w:rPr>
-              <w:t>Durum</w:t>
+              <w:t>Faz</w:t>
             </w:r>
           </w:p>
         </w:tc>
@@ -345,7 +199,7 @@
       <w:tr>
         <w:tc>
           <w:tcPr>
-            <w:tcW w:type="dxa" w:w="3135"/>
+            <w:tcW w:type="dxa" w:w="4703"/>
           </w:tcPr>
           <w:p>
             <w:r/>
@@ -359,7 +213,7 @@
         </w:tc>
         <w:tc>
           <w:tcPr>
-            <w:tcW w:type="dxa" w:w="3135"/>
+            <w:tcW w:type="dxa" w:w="4703"/>
           </w:tcPr>
           <w:p>
             <w:r/>
@@ -367,21 +221,7 @@
               <w:rPr>
                 <w:sz w:val="20"/>
               </w:rPr>
-              <w:t>YOLOv8 + IOU Tracker + Hungarian Matching</w:t>
-            </w:r>
-          </w:p>
-        </w:tc>
-        <w:tc>
-          <w:tcPr>
-            <w:tcW w:type="dxa" w:w="3135"/>
-          </w:tcPr>
-          <w:p>
-            <w:r/>
-            <w:r>
-              <w:rPr>
-                <w:sz w:val="20"/>
-              </w:rPr>
-              <w:t>HAZIR</w:t>
+              <w:t>Faz 1</w:t>
             </w:r>
           </w:p>
         </w:tc>
@@ -389,7 +229,7 @@
       <w:tr>
         <w:tc>
           <w:tcPr>
-            <w:tcW w:type="dxa" w:w="3135"/>
+            <w:tcW w:type="dxa" w:w="4703"/>
           </w:tcPr>
           <w:p>
             <w:r/>
@@ -403,7 +243,7 @@
         </w:tc>
         <w:tc>
           <w:tcPr>
-            <w:tcW w:type="dxa" w:w="3135"/>
+            <w:tcW w:type="dxa" w:w="4703"/>
           </w:tcPr>
           <w:p>
             <w:r/>
@@ -411,21 +251,7 @@
               <w:rPr>
                 <w:sz w:val="20"/>
               </w:rPr>
-              <w:t>YOLOv8 Multi-Class (car, motorcycle, bus, truck)</w:t>
-            </w:r>
-          </w:p>
-        </w:tc>
-        <w:tc>
-          <w:tcPr>
-            <w:tcW w:type="dxa" w:w="3135"/>
-          </w:tcPr>
-          <w:p>
-            <w:r/>
-            <w:r>
-              <w:rPr>
-                <w:sz w:val="20"/>
-              </w:rPr>
-              <w:t>HAZIR</w:t>
+              <w:t>Faz 1</w:t>
             </w:r>
           </w:p>
         </w:tc>
@@ -433,7 +259,7 @@
       <w:tr>
         <w:tc>
           <w:tcPr>
-            <w:tcW w:type="dxa" w:w="3135"/>
+            <w:tcW w:type="dxa" w:w="4703"/>
           </w:tcPr>
           <w:p>
             <w:r/>
@@ -447,7 +273,7 @@
         </w:tc>
         <w:tc>
           <w:tcPr>
-            <w:tcW w:type="dxa" w:w="3135"/>
+            <w:tcW w:type="dxa" w:w="4703"/>
           </w:tcPr>
           <w:p>
             <w:r/>
@@ -455,21 +281,7 @@
               <w:rPr>
                 <w:sz w:val="20"/>
               </w:rPr>
-              <w:t>YOLOv8 (COCO boat class + custom fine-tune)</w:t>
-            </w:r>
-          </w:p>
-        </w:tc>
-        <w:tc>
-          <w:tcPr>
-            <w:tcW w:type="dxa" w:w="3135"/>
-          </w:tcPr>
-          <w:p>
-            <w:r/>
-            <w:r>
-              <w:rPr>
-                <w:sz w:val="20"/>
-              </w:rPr>
-              <w:t>HAZIR</w:t>
+              <w:t>Faz 1</w:t>
             </w:r>
           </w:p>
         </w:tc>
@@ -477,7 +289,7 @@
       <w:tr>
         <w:tc>
           <w:tcPr>
-            <w:tcW w:type="dxa" w:w="3135"/>
+            <w:tcW w:type="dxa" w:w="4703"/>
           </w:tcPr>
           <w:p>
             <w:r/>
@@ -491,7 +303,7 @@
         </w:tc>
         <w:tc>
           <w:tcPr>
-            <w:tcW w:type="dxa" w:w="3135"/>
+            <w:tcW w:type="dxa" w:w="4703"/>
           </w:tcPr>
           <w:p>
             <w:r/>
@@ -499,21 +311,7 @@
               <w:rPr>
                 <w:sz w:val="20"/>
               </w:rPr>
-              <w:t>YOLOv8 (cat/dog class + zone check)</w:t>
-            </w:r>
-          </w:p>
-        </w:tc>
-        <w:tc>
-          <w:tcPr>
-            <w:tcW w:type="dxa" w:w="3135"/>
-          </w:tcPr>
-          <w:p>
-            <w:r/>
-            <w:r>
-              <w:rPr>
-                <w:sz w:val="20"/>
-              </w:rPr>
-              <w:t>HAZIR</w:t>
+              <w:t>Faz 1</w:t>
             </w:r>
           </w:p>
         </w:tc>
@@ -521,7 +319,7 @@
       <w:tr>
         <w:tc>
           <w:tcPr>
-            <w:tcW w:type="dxa" w:w="3135"/>
+            <w:tcW w:type="dxa" w:w="4703"/>
           </w:tcPr>
           <w:p>
             <w:r/>
@@ -535,7 +333,7 @@
         </w:tc>
         <w:tc>
           <w:tcPr>
-            <w:tcW w:type="dxa" w:w="3135"/>
+            <w:tcW w:type="dxa" w:w="4703"/>
           </w:tcPr>
           <w:p>
             <w:r/>
@@ -543,108 +341,7 @@
               <w:rPr>
                 <w:sz w:val="20"/>
               </w:rPr>
-              <w:t>YOLOv8 + Grid Overlay + Occupancy Map</w:t>
-            </w:r>
-          </w:p>
-        </w:tc>
-        <w:tc>
-          <w:tcPr>
-            <w:tcW w:type="dxa" w:w="3135"/>
-          </w:tcPr>
-          <w:p>
-            <w:r/>
-            <w:r>
-              <w:rPr>
-                <w:sz w:val="20"/>
-              </w:rPr>
-              <w:t>HAZIR</w:t>
-            </w:r>
-          </w:p>
-        </w:tc>
-      </w:tr>
-    </w:tbl>
-    <w:p/>
-    <w:p>
-      <w:pPr>
-        <w:pStyle w:val="Heading2"/>
-      </w:pPr>
-      <w:r>
-        <w:rPr>
-          <w:color w:val="B8922F"/>
-        </w:rPr>
-        <w:t>Faz 2 - Bolge Analizi &amp; Anomali Tespiti (Hafta 4-10)</w:t>
-      </w:r>
-    </w:p>
-    <w:p>
-      <w:r>
-        <w:rPr>
-          <w:b/>
-          <w:color w:val="D48A1A"/>
-        </w:rPr>
-        <w:t>Durum: %60-70 HAZIR - uyarlama gerekli</w:t>
-      </w:r>
-    </w:p>
-    <w:tbl>
-      <w:tblPr>
-        <w:tblStyle w:val="TableGrid"/>
-        <w:tblW w:type="auto" w:w="0"/>
-        <w:jc w:val="center"/>
-        <w:tblLook w:firstColumn="1" w:firstRow="1" w:lastColumn="0" w:lastRow="0" w:noHBand="0" w:noVBand="1" w:val="04A0"/>
-      </w:tblPr>
-      <w:tblGrid>
-        <w:gridCol w:w="3135"/>
-        <w:gridCol w:w="3135"/>
-        <w:gridCol w:w="3135"/>
-      </w:tblGrid>
-      <w:tr>
-        <w:tc>
-          <w:tcPr>
-            <w:tcW w:type="dxa" w:w="3135"/>
-            <w:shd w:fill="1A1A2A" w:val="clear"/>
-          </w:tcPr>
-          <w:p>
-            <w:r/>
-            <w:r>
-              <w:rPr>
-                <w:b/>
-                <w:color w:val="FFFFFF"/>
-                <w:sz w:val="20"/>
-              </w:rPr>
-              <w:t>Use Case</w:t>
-            </w:r>
-          </w:p>
-        </w:tc>
-        <w:tc>
-          <w:tcPr>
-            <w:tcW w:type="dxa" w:w="3135"/>
-            <w:shd w:fill="1A1A2A" w:val="clear"/>
-          </w:tcPr>
-          <w:p>
-            <w:r/>
-            <w:r>
-              <w:rPr>
-                <w:b/>
-                <w:color w:val="FFFFFF"/>
-                <w:sz w:val="20"/>
-              </w:rPr>
-              <w:t>Yontem</w:t>
-            </w:r>
-          </w:p>
-        </w:tc>
-        <w:tc>
-          <w:tcPr>
-            <w:tcW w:type="dxa" w:w="3135"/>
-            <w:shd w:fill="1A1A2A" w:val="clear"/>
-          </w:tcPr>
-          <w:p>
-            <w:r/>
-            <w:r>
-              <w:rPr>
-                <w:b/>
-                <w:color w:val="FFFFFF"/>
-                <w:sz w:val="20"/>
-              </w:rPr>
-              <w:t>Durum</w:t>
+              <w:t>Faz 1</w:t>
             </w:r>
           </w:p>
         </w:tc>
@@ -652,7 +349,7 @@
       <w:tr>
         <w:tc>
           <w:tcPr>
-            <w:tcW w:type="dxa" w:w="3135"/>
+            <w:tcW w:type="dxa" w:w="4703"/>
           </w:tcPr>
           <w:p>
             <w:r/>
@@ -666,7 +363,7 @@
         </w:tc>
         <w:tc>
           <w:tcPr>
-            <w:tcW w:type="dxa" w:w="3135"/>
+            <w:tcW w:type="dxa" w:w="4703"/>
           </w:tcPr>
           <w:p>
             <w:r/>
@@ -674,21 +371,7 @@
               <w:rPr>
                 <w:sz w:val="20"/>
               </w:rPr>
-              <w:t>People Detection + Polygon Zone Mapping</w:t>
-            </w:r>
-          </w:p>
-        </w:tc>
-        <w:tc>
-          <w:tcPr>
-            <w:tcW w:type="dxa" w:w="3135"/>
-          </w:tcPr>
-          <w:p>
-            <w:r/>
-            <w:r>
-              <w:rPr>
-                <w:sz w:val="20"/>
-              </w:rPr>
-              <w:t>%70 HAZIR</w:t>
+              <w:t>Faz 2</w:t>
             </w:r>
           </w:p>
         </w:tc>
@@ -696,7 +379,7 @@
       <w:tr>
         <w:tc>
           <w:tcPr>
-            <w:tcW w:type="dxa" w:w="3135"/>
+            <w:tcW w:type="dxa" w:w="4703"/>
           </w:tcPr>
           <w:p>
             <w:r/>
@@ -710,7 +393,7 @@
         </w:tc>
         <w:tc>
           <w:tcPr>
-            <w:tcW w:type="dxa" w:w="3135"/>
+            <w:tcW w:type="dxa" w:w="4703"/>
           </w:tcPr>
           <w:p>
             <w:r/>
@@ -718,21 +401,7 @@
               <w:rPr>
                 <w:sz w:val="20"/>
               </w:rPr>
-              <w:t>Object Detection + Geofence Control</w:t>
-            </w:r>
-          </w:p>
-        </w:tc>
-        <w:tc>
-          <w:tcPr>
-            <w:tcW w:type="dxa" w:w="3135"/>
-          </w:tcPr>
-          <w:p>
-            <w:r/>
-            <w:r>
-              <w:rPr>
-                <w:sz w:val="20"/>
-              </w:rPr>
-              <w:t>%70 HAZIR</w:t>
+              <w:t>Faz 2</w:t>
             </w:r>
           </w:p>
         </w:tc>
@@ -740,7 +409,7 @@
       <w:tr>
         <w:tc>
           <w:tcPr>
-            <w:tcW w:type="dxa" w:w="3135"/>
+            <w:tcW w:type="dxa" w:w="4703"/>
           </w:tcPr>
           <w:p>
             <w:r/>
@@ -754,7 +423,7 @@
         </w:tc>
         <w:tc>
           <w:tcPr>
-            <w:tcW w:type="dxa" w:w="3135"/>
+            <w:tcW w:type="dxa" w:w="4703"/>
           </w:tcPr>
           <w:p>
             <w:r/>
@@ -762,21 +431,7 @@
               <w:rPr>
                 <w:sz w:val="20"/>
               </w:rPr>
-              <w:t>MOG2 Motion Analysis + Baseline Comparison</w:t>
-            </w:r>
-          </w:p>
-        </w:tc>
-        <w:tc>
-          <w:tcPr>
-            <w:tcW w:type="dxa" w:w="3135"/>
-          </w:tcPr>
-          <w:p>
-            <w:r/>
-            <w:r>
-              <w:rPr>
-                <w:sz w:val="20"/>
-              </w:rPr>
-              <w:t>%60 HAZIR</w:t>
+              <w:t>Faz 2</w:t>
             </w:r>
           </w:p>
         </w:tc>
@@ -784,7 +439,7 @@
       <w:tr>
         <w:tc>
           <w:tcPr>
-            <w:tcW w:type="dxa" w:w="3135"/>
+            <w:tcW w:type="dxa" w:w="4703"/>
           </w:tcPr>
           <w:p>
             <w:r/>
@@ -798,7 +453,7 @@
         </w:tc>
         <w:tc>
           <w:tcPr>
-            <w:tcW w:type="dxa" w:w="3135"/>
+            <w:tcW w:type="dxa" w:w="4703"/>
           </w:tcPr>
           <w:p>
             <w:r/>
@@ -806,108 +461,7 @@
               <w:rPr>
                 <w:sz w:val="20"/>
               </w:rPr>
-              <w:t>Periodic Image Comparison + New Object Detection</w:t>
-            </w:r>
-          </w:p>
-        </w:tc>
-        <w:tc>
-          <w:tcPr>
-            <w:tcW w:type="dxa" w:w="3135"/>
-          </w:tcPr>
-          <w:p>
-            <w:r/>
-            <w:r>
-              <w:rPr>
-                <w:sz w:val="20"/>
-              </w:rPr>
-              <w:t>Gelistirme gerekli</w:t>
-            </w:r>
-          </w:p>
-        </w:tc>
-      </w:tr>
-    </w:tbl>
-    <w:p/>
-    <w:p>
-      <w:pPr>
-        <w:pStyle w:val="Heading2"/>
-      </w:pPr>
-      <w:r>
-        <w:rPr>
-          <w:color w:val="B8922F"/>
-        </w:rPr>
-        <w:t>Faz 3 - Gelismis Analiz (Hafta 8-14)</w:t>
-      </w:r>
-    </w:p>
-    <w:p>
-      <w:r>
-        <w:rPr>
-          <w:b/>
-          <w:color w:val="D48A1A"/>
-        </w:rPr>
-        <w:t>Durum: GELISTIRME GEREKLI - etiketli veri lazim</w:t>
-      </w:r>
-    </w:p>
-    <w:tbl>
-      <w:tblPr>
-        <w:tblStyle w:val="TableGrid"/>
-        <w:tblW w:type="auto" w:w="0"/>
-        <w:jc w:val="center"/>
-        <w:tblLook w:firstColumn="1" w:firstRow="1" w:lastColumn="0" w:lastRow="0" w:noHBand="0" w:noVBand="1" w:val="04A0"/>
-      </w:tblPr>
-      <w:tblGrid>
-        <w:gridCol w:w="3135"/>
-        <w:gridCol w:w="3135"/>
-        <w:gridCol w:w="3135"/>
-      </w:tblGrid>
-      <w:tr>
-        <w:tc>
-          <w:tcPr>
-            <w:tcW w:type="dxa" w:w="3135"/>
-            <w:shd w:fill="1A1A2A" w:val="clear"/>
-          </w:tcPr>
-          <w:p>
-            <w:r/>
-            <w:r>
-              <w:rPr>
-                <w:b/>
-                <w:color w:val="FFFFFF"/>
-                <w:sz w:val="20"/>
-              </w:rPr>
-              <w:t>Use Case</w:t>
-            </w:r>
-          </w:p>
-        </w:tc>
-        <w:tc>
-          <w:tcPr>
-            <w:tcW w:type="dxa" w:w="3135"/>
-            <w:shd w:fill="1A1A2A" w:val="clear"/>
-          </w:tcPr>
-          <w:p>
-            <w:r/>
-            <w:r>
-              <w:rPr>
-                <w:b/>
-                <w:color w:val="FFFFFF"/>
-                <w:sz w:val="20"/>
-              </w:rPr>
-              <w:t>Yontem</w:t>
-            </w:r>
-          </w:p>
-        </w:tc>
-        <w:tc>
-          <w:tcPr>
-            <w:tcW w:type="dxa" w:w="3135"/>
-            <w:shd w:fill="1A1A2A" w:val="clear"/>
-          </w:tcPr>
-          <w:p>
-            <w:r/>
-            <w:r>
-              <w:rPr>
-                <w:b/>
-                <w:color w:val="FFFFFF"/>
-                <w:sz w:val="20"/>
-              </w:rPr>
-              <w:t>Durum</w:t>
+              <w:t>Faz 2</w:t>
             </w:r>
           </w:p>
         </w:tc>
@@ -915,7 +469,7 @@
       <w:tr>
         <w:tc>
           <w:tcPr>
-            <w:tcW w:type="dxa" w:w="3135"/>
+            <w:tcW w:type="dxa" w:w="4703"/>
           </w:tcPr>
           <w:p>
             <w:r/>
@@ -929,7 +483,7 @@
         </w:tc>
         <w:tc>
           <w:tcPr>
-            <w:tcW w:type="dxa" w:w="3135"/>
+            <w:tcW w:type="dxa" w:w="4703"/>
           </w:tcPr>
           <w:p>
             <w:r/>
@@ -937,21 +491,7 @@
               <w:rPr>
                 <w:sz w:val="20"/>
               </w:rPr>
-              <w:t>Feature Matching + SSIM + Deep Learning</w:t>
-            </w:r>
-          </w:p>
-        </w:tc>
-        <w:tc>
-          <w:tcPr>
-            <w:tcW w:type="dxa" w:w="3135"/>
-          </w:tcPr>
-          <w:p>
-            <w:r/>
-            <w:r>
-              <w:rPr>
-                <w:sz w:val="20"/>
-              </w:rPr>
-              <w:t>Gelistirme gerekli</w:t>
+              <w:t>Faz 3</w:t>
             </w:r>
           </w:p>
         </w:tc>
@@ -959,7 +499,7 @@
       <w:tr>
         <w:tc>
           <w:tcPr>
-            <w:tcW w:type="dxa" w:w="3135"/>
+            <w:tcW w:type="dxa" w:w="4703"/>
           </w:tcPr>
           <w:p>
             <w:r/>
@@ -973,7 +513,7 @@
         </w:tc>
         <w:tc>
           <w:tcPr>
-            <w:tcW w:type="dxa" w:w="3135"/>
+            <w:tcW w:type="dxa" w:w="4703"/>
           </w:tcPr>
           <w:p>
             <w:r/>
@@ -981,21 +521,7 @@
               <w:rPr>
                 <w:sz w:val="20"/>
               </w:rPr>
-              <w:t>Semantic Segmentation (U-Net / SAM)</w:t>
-            </w:r>
-          </w:p>
-        </w:tc>
-        <w:tc>
-          <w:tcPr>
-            <w:tcW w:type="dxa" w:w="3135"/>
-          </w:tcPr>
-          <w:p>
-            <w:r/>
-            <w:r>
-              <w:rPr>
-                <w:sz w:val="20"/>
-              </w:rPr>
-              <w:t>Gelistirme gerekli</w:t>
+              <w:t>Faz 3</w:t>
             </w:r>
           </w:p>
         </w:tc>
@@ -1003,51 +529,7 @@
       <w:tr>
         <w:tc>
           <w:tcPr>
-            <w:tcW w:type="dxa" w:w="3135"/>
-          </w:tcPr>
-          <w:p>
-            <w:r/>
-            <w:r>
-              <w:rPr>
-                <w:sz w:val="20"/>
-              </w:rPr>
-              <w:t>Coastal Project Inspection</w:t>
-            </w:r>
-          </w:p>
-        </w:tc>
-        <w:tc>
-          <w:tcPr>
-            <w:tcW w:type="dxa" w:w="3135"/>
-          </w:tcPr>
-          <w:p>
-            <w:r/>
-            <w:r>
-              <w:rPr>
-                <w:sz w:val="20"/>
-              </w:rPr>
-              <w:t>Anomaly Detection + Baseline Comparison</w:t>
-            </w:r>
-          </w:p>
-        </w:tc>
-        <w:tc>
-          <w:tcPr>
-            <w:tcW w:type="dxa" w:w="3135"/>
-          </w:tcPr>
-          <w:p>
-            <w:r/>
-            <w:r>
-              <w:rPr>
-                <w:sz w:val="20"/>
-              </w:rPr>
-              <w:t>Kisitli kapsam</w:t>
-            </w:r>
-          </w:p>
-        </w:tc>
-      </w:tr>
-      <w:tr>
-        <w:tc>
-          <w:tcPr>
-            <w:tcW w:type="dxa" w:w="3135"/>
+            <w:tcW w:type="dxa" w:w="4703"/>
           </w:tcPr>
           <w:p>
             <w:r/>
@@ -1061,7 +543,7 @@
         </w:tc>
         <w:tc>
           <w:tcPr>
-            <w:tcW w:type="dxa" w:w="3135"/>
+            <w:tcW w:type="dxa" w:w="4703"/>
           </w:tcPr>
           <w:p>
             <w:r/>
@@ -1069,13 +551,15 @@
               <w:rPr>
                 <w:sz w:val="20"/>
               </w:rPr>
-              <w:t>Object Detection + Change Detection</w:t>
+              <w:t>Faz 3</w:t>
             </w:r>
           </w:p>
         </w:tc>
+      </w:tr>
+      <w:tr>
         <w:tc>
           <w:tcPr>
-            <w:tcW w:type="dxa" w:w="3135"/>
+            <w:tcW w:type="dxa" w:w="4703"/>
           </w:tcPr>
           <w:p>
             <w:r/>
@@ -1083,137 +567,13 @@
               <w:rPr>
                 <w:sz w:val="20"/>
               </w:rPr>
-              <w:t>Change det. bagimli</w:t>
-            </w:r>
-          </w:p>
-        </w:tc>
-      </w:tr>
-    </w:tbl>
-    <w:p>
-      <w:pPr>
-        <w:pStyle w:val="Heading1"/>
-      </w:pPr>
-      <w:r>
-        <w:rPr>
-          <w:color w:val="1A1A1A"/>
-        </w:rPr>
-        <w:t>4. Kapsam Sinirlari</w:t>
-      </w:r>
-    </w:p>
-    <w:p>
-      <w:r>
-        <w:t>Asagidaki use case'lerde teknik veya fiziksel sinirlamalar mevcuttur. Yapamayacagimiz veya sinirli kalacagimiz alanlari seffaf bicimde paylasiyoruz.</w:t>
-      </w:r>
-    </w:p>
-    <w:p>
-      <w:r>
-        <w:rPr>
-          <w:b/>
-          <w:color w:val="C0392B"/>
-        </w:rPr>
-        <w:t xml:space="preserve">Sea-Level Monitoring - YAPILAMAZ: </w:t>
-      </w:r>
-      <w:r>
-        <w:t>Drone kamerasi ile santimetre hassasiyetinde deniz seviyesi olcumu fiziksel olarak mumkun degildir. Tide gauge sensoru veya LiDAR gereklidir. Alternatif olarak sabit referans noktalari uzerinden yaklasik gorsel seviye degisim tespiti (+-20-30cm) sunulabilir.</w:t>
-      </w:r>
-    </w:p>
-    <w:p>
-      <w:r>
-        <w:rPr>
-          <w:b/>
-          <w:color w:val="D48A1A"/>
-        </w:rPr>
-        <w:t xml:space="preserve">Coastal Inspection - KISITLI KAPSAM: </w:t>
-      </w:r>
-      <w:r>
-        <w:t>BBA bilgisayar gorusu alaninda uzmandir, kiyi muhendisligi alaninda degil. Genel gorsel anomali tespiti (renk degisimi, sekil bozulmasi) yapilabilir ancak muhendislik seviyesinde catlak analizi veya yapisal risk degerlendirmesi yapilamaz. Bu kapsamın genisletilmesi, Aerosmart'in saglayacagi domain-specific etiketli veriye baglidir.</w:t>
-      </w:r>
-    </w:p>
-    <w:p>
-      <w:pPr>
-        <w:pStyle w:val="Heading1"/>
-      </w:pPr>
-      <w:r>
-        <w:rPr>
-          <w:color w:val="1A1A1A"/>
-        </w:rPr>
-        <w:t>5. Onerimiz: Drone-First + Sabit Kamera Destegi</w:t>
-      </w:r>
-    </w:p>
-    <w:p>
-      <w:r>
-        <w:t>Drone patrolu tum use case'ler icin birincil cozumdur. Sabit kameralar, patrol ucuslari arasindaki bosluklari kapatmak icin kritik noktalarda tamamlayici bir katman olarak devreye girebilir.</w:t>
-      </w:r>
-    </w:p>
-    <w:tbl>
-      <w:tblPr>
-        <w:tblStyle w:val="TableGrid"/>
-        <w:tblW w:type="auto" w:w="0"/>
-        <w:jc w:val="center"/>
-        <w:tblLook w:firstColumn="1" w:firstRow="1" w:lastColumn="0" w:lastRow="0" w:noHBand="0" w:noVBand="1" w:val="04A0"/>
-      </w:tblPr>
-      <w:tblGrid>
-        <w:gridCol w:w="3135"/>
-        <w:gridCol w:w="3135"/>
-        <w:gridCol w:w="3135"/>
-      </w:tblGrid>
-      <w:tr>
-        <w:tc>
-          <w:tcPr>
-            <w:tcW w:type="dxa" w:w="3135"/>
-            <w:shd w:fill="1A1A2A" w:val="clear"/>
-          </w:tcPr>
-          <w:p>
-            <w:r/>
-            <w:r>
-              <w:rPr>
-                <w:b/>
-                <w:color w:val="FFFFFF"/>
-                <w:sz w:val="20"/>
-              </w:rPr>
-              <w:t>Use Case</w:t>
+              <w:t>Coastal Project Inspection *</w:t>
             </w:r>
           </w:p>
         </w:tc>
         <w:tc>
           <w:tcPr>
-            <w:tcW w:type="dxa" w:w="3135"/>
-            <w:shd w:fill="1A1A2A" w:val="clear"/>
-          </w:tcPr>
-          <w:p>
-            <w:r/>
-            <w:r>
-              <w:rPr>
-                <w:b/>
-                <w:color w:val="FFFFFF"/>
-                <w:sz w:val="20"/>
-              </w:rPr>
-              <w:t>Onerilen Cozum</w:t>
-            </w:r>
-          </w:p>
-        </w:tc>
-        <w:tc>
-          <w:tcPr>
-            <w:tcW w:type="dxa" w:w="3135"/>
-            <w:shd w:fill="1A1A2A" w:val="clear"/>
-          </w:tcPr>
-          <w:p>
-            <w:r/>
-            <w:r>
-              <w:rPr>
-                <w:b/>
-                <w:color w:val="FFFFFF"/>
-                <w:sz w:val="20"/>
-              </w:rPr>
-              <w:t>Sabit Kamera Destegi</w:t>
-            </w:r>
-          </w:p>
-        </w:tc>
-      </w:tr>
-      <w:tr>
-        <w:tc>
-          <w:tcPr>
-            <w:tcW w:type="dxa" w:w="3135"/>
+            <w:tcW w:type="dxa" w:w="4703"/>
           </w:tcPr>
           <w:p>
             <w:r/>
@@ -1221,387 +581,7 @@
               <w:rPr>
                 <w:sz w:val="20"/>
               </w:rPr>
-              <w:t>People counting</w:t>
-            </w:r>
-          </w:p>
-        </w:tc>
-        <w:tc>
-          <w:tcPr>
-            <w:tcW w:type="dxa" w:w="3135"/>
-          </w:tcPr>
-          <w:p>
-            <w:r/>
-            <w:r>
-              <w:rPr>
-                <w:sz w:val="20"/>
-              </w:rPr>
-              <w:t>Drone + Sabit Kamera</w:t>
-            </w:r>
-          </w:p>
-        </w:tc>
-        <w:tc>
-          <w:tcPr>
-            <w:tcW w:type="dxa" w:w="3135"/>
-          </w:tcPr>
-          <w:p>
-            <w:r/>
-            <w:r>
-              <w:rPr>
-                <w:sz w:val="20"/>
-              </w:rPr>
-              <w:t>Patrol arasinda 7/24 destek</w:t>
-            </w:r>
-          </w:p>
-        </w:tc>
-      </w:tr>
-      <w:tr>
-        <w:tc>
-          <w:tcPr>
-            <w:tcW w:type="dxa" w:w="3135"/>
-          </w:tcPr>
-          <w:p>
-            <w:r/>
-            <w:r>
-              <w:rPr>
-                <w:sz w:val="20"/>
-              </w:rPr>
-              <w:t>Zone density</w:t>
-            </w:r>
-          </w:p>
-        </w:tc>
-        <w:tc>
-          <w:tcPr>
-            <w:tcW w:type="dxa" w:w="3135"/>
-          </w:tcPr>
-          <w:p>
-            <w:r/>
-            <w:r>
-              <w:rPr>
-                <w:sz w:val="20"/>
-              </w:rPr>
-              <w:t>Drone + Sabit Kamera</w:t>
-            </w:r>
-          </w:p>
-        </w:tc>
-        <w:tc>
-          <w:tcPr>
-            <w:tcW w:type="dxa" w:w="3135"/>
-          </w:tcPr>
-          <w:p>
-            <w:r/>
-            <w:r>
-              <w:rPr>
-                <w:sz w:val="20"/>
-              </w:rPr>
-              <w:t>Surekli izleme destegi</w:t>
-            </w:r>
-          </w:p>
-        </w:tc>
-      </w:tr>
-      <w:tr>
-        <w:tc>
-          <w:tcPr>
-            <w:tcW w:type="dxa" w:w="3135"/>
-          </w:tcPr>
-          <w:p>
-            <w:r/>
-            <w:r>
-              <w:rPr>
-                <w:sz w:val="20"/>
-              </w:rPr>
-              <w:t>Parking occupancy</w:t>
-            </w:r>
-          </w:p>
-        </w:tc>
-        <w:tc>
-          <w:tcPr>
-            <w:tcW w:type="dxa" w:w="3135"/>
-          </w:tcPr>
-          <w:p>
-            <w:r/>
-            <w:r>
-              <w:rPr>
-                <w:sz w:val="20"/>
-              </w:rPr>
-              <w:t>Drone + Sabit Kamera</w:t>
-            </w:r>
-          </w:p>
-        </w:tc>
-        <w:tc>
-          <w:tcPr>
-            <w:tcW w:type="dxa" w:w="3135"/>
-          </w:tcPr>
-          <w:p>
-            <w:r/>
-            <w:r>
-              <w:rPr>
-                <w:sz w:val="20"/>
-              </w:rPr>
-              <w:t>Surekli doluluk takibi</w:t>
-            </w:r>
-          </w:p>
-        </w:tc>
-      </w:tr>
-      <w:tr>
-        <w:tc>
-          <w:tcPr>
-            <w:tcW w:type="dxa" w:w="3135"/>
-          </w:tcPr>
-          <w:p>
-            <w:r/>
-            <w:r>
-              <w:rPr>
-                <w:sz w:val="20"/>
-              </w:rPr>
-              <w:t>Restricted zone intrusion</w:t>
-            </w:r>
-          </w:p>
-        </w:tc>
-        <w:tc>
-          <w:tcPr>
-            <w:tcW w:type="dxa" w:w="3135"/>
-          </w:tcPr>
-          <w:p>
-            <w:r/>
-            <w:r>
-              <w:rPr>
-                <w:sz w:val="20"/>
-              </w:rPr>
-              <w:t>Drone + Sabit Kamera</w:t>
-            </w:r>
-          </w:p>
-        </w:tc>
-        <w:tc>
-          <w:tcPr>
-            <w:tcW w:type="dxa" w:w="3135"/>
-          </w:tcPr>
-          <w:p>
-            <w:r/>
-            <w:r>
-              <w:rPr>
-                <w:sz w:val="20"/>
-              </w:rPr>
-              <w:t>Patrollar arasi 7/24 alarm</w:t>
-            </w:r>
-          </w:p>
-        </w:tc>
-      </w:tr>
-      <w:tr>
-        <w:tc>
-          <w:tcPr>
-            <w:tcW w:type="dxa" w:w="3135"/>
-          </w:tcPr>
-          <w:p>
-            <w:r/>
-            <w:r>
-              <w:rPr>
-                <w:sz w:val="20"/>
-              </w:rPr>
-              <w:t>Anomaly detection</w:t>
-            </w:r>
-          </w:p>
-        </w:tc>
-        <w:tc>
-          <w:tcPr>
-            <w:tcW w:type="dxa" w:w="3135"/>
-          </w:tcPr>
-          <w:p>
-            <w:r/>
-            <w:r>
-              <w:rPr>
-                <w:sz w:val="20"/>
-              </w:rPr>
-              <w:t>Drone + Sabit Kamera</w:t>
-            </w:r>
-          </w:p>
-        </w:tc>
-        <w:tc>
-          <w:tcPr>
-            <w:tcW w:type="dxa" w:w="3135"/>
-          </w:tcPr>
-          <w:p>
-            <w:r/>
-            <w:r>
-              <w:rPr>
-                <w:sz w:val="20"/>
-              </w:rPr>
-              <w:t>Surekli lokal izleme</w:t>
-            </w:r>
-          </w:p>
-        </w:tc>
-      </w:tr>
-      <w:tr>
-        <w:tc>
-          <w:tcPr>
-            <w:tcW w:type="dxa" w:w="3135"/>
-          </w:tcPr>
-          <w:p>
-            <w:r/>
-            <w:r>
-              <w:rPr>
-                <w:sz w:val="20"/>
-              </w:rPr>
-              <w:t>Change detection</w:t>
-            </w:r>
-          </w:p>
-        </w:tc>
-        <w:tc>
-          <w:tcPr>
-            <w:tcW w:type="dxa" w:w="3135"/>
-          </w:tcPr>
-          <w:p>
-            <w:r/>
-            <w:r>
-              <w:rPr>
-                <w:sz w:val="20"/>
-              </w:rPr>
-              <w:t>Drone</w:t>
-            </w:r>
-          </w:p>
-        </w:tc>
-        <w:tc>
-          <w:tcPr>
-            <w:tcW w:type="dxa" w:w="3135"/>
-          </w:tcPr>
-          <w:p>
-            <w:r/>
-            <w:r>
-              <w:rPr>
-                <w:sz w:val="20"/>
-              </w:rPr>
-              <w:t>—</w:t>
-            </w:r>
-          </w:p>
-        </w:tc>
-      </w:tr>
-      <w:tr>
-        <w:tc>
-          <w:tcPr>
-            <w:tcW w:type="dxa" w:w="3135"/>
-          </w:tcPr>
-          <w:p>
-            <w:r/>
-            <w:r>
-              <w:rPr>
-                <w:sz w:val="20"/>
-              </w:rPr>
-              <w:t>Shoreline tracking</w:t>
-            </w:r>
-          </w:p>
-        </w:tc>
-        <w:tc>
-          <w:tcPr>
-            <w:tcW w:type="dxa" w:w="3135"/>
-          </w:tcPr>
-          <w:p>
-            <w:r/>
-            <w:r>
-              <w:rPr>
-                <w:sz w:val="20"/>
-              </w:rPr>
-              <w:t>Drone</w:t>
-            </w:r>
-          </w:p>
-        </w:tc>
-        <w:tc>
-          <w:tcPr>
-            <w:tcW w:type="dxa" w:w="3135"/>
-          </w:tcPr>
-          <w:p>
-            <w:r/>
-            <w:r>
-              <w:rPr>
-                <w:sz w:val="20"/>
-              </w:rPr>
-              <w:t>—</w:t>
-            </w:r>
-          </w:p>
-        </w:tc>
-      </w:tr>
-      <w:tr>
-        <w:tc>
-          <w:tcPr>
-            <w:tcW w:type="dxa" w:w="3135"/>
-          </w:tcPr>
-          <w:p>
-            <w:r/>
-            <w:r>
-              <w:rPr>
-                <w:sz w:val="20"/>
-              </w:rPr>
-              <w:t>Coastal inspection</w:t>
-            </w:r>
-          </w:p>
-        </w:tc>
-        <w:tc>
-          <w:tcPr>
-            <w:tcW w:type="dxa" w:w="3135"/>
-          </w:tcPr>
-          <w:p>
-            <w:r/>
-            <w:r>
-              <w:rPr>
-                <w:sz w:val="20"/>
-              </w:rPr>
-              <w:t>Drone</w:t>
-            </w:r>
-          </w:p>
-        </w:tc>
-        <w:tc>
-          <w:tcPr>
-            <w:tcW w:type="dxa" w:w="3135"/>
-          </w:tcPr>
-          <w:p>
-            <w:r/>
-            <w:r>
-              <w:rPr>
-                <w:sz w:val="20"/>
-              </w:rPr>
-              <w:t>—</w:t>
-            </w:r>
-          </w:p>
-        </w:tc>
-      </w:tr>
-      <w:tr>
-        <w:tc>
-          <w:tcPr>
-            <w:tcW w:type="dxa" w:w="3135"/>
-          </w:tcPr>
-          <w:p>
-            <w:r/>
-            <w:r>
-              <w:rPr>
-                <w:sz w:val="20"/>
-              </w:rPr>
-              <w:t>Aerial asset monitoring</w:t>
-            </w:r>
-          </w:p>
-        </w:tc>
-        <w:tc>
-          <w:tcPr>
-            <w:tcW w:type="dxa" w:w="3135"/>
-          </w:tcPr>
-          <w:p>
-            <w:r/>
-            <w:r>
-              <w:rPr>
-                <w:sz w:val="20"/>
-              </w:rPr>
-              <w:t>Drone</w:t>
-            </w:r>
-          </w:p>
-        </w:tc>
-        <w:tc>
-          <w:tcPr>
-            <w:tcW w:type="dxa" w:w="3135"/>
-          </w:tcPr>
-          <w:p>
-            <w:r/>
-            <w:r>
-              <w:rPr>
-                <w:sz w:val="20"/>
-              </w:rPr>
-              <w:t>—</w:t>
+              <w:t>Faz 3</w:t>
             </w:r>
           </w:p>
         </w:tc>
@@ -1613,9 +593,13 @@
         <w:rPr>
           <w:b/>
         </w:rPr>
-        <w:t>Drone patrolu birincil cozumdur. Sabit kameralar, patrol ucuslari arasindaki bosluklari kapatmak icin tamamlayici bir katman olarak devreye girebilir. BBA'nin AI sunucusu her iki kaynagi da ayni inference engine uzerinden isleyebilir.</w:t>
+        <w:t xml:space="preserve">* Coastal Inspection: </w:t>
+      </w:r>
+      <w:r>
+        <w:t>Gorsel anomali tespiti yapilabilir. Muhendislik seviyesinde yapisal analiz kapsam disindadir.</w:t>
       </w:r>
     </w:p>
+    <w:p/>
     <w:p>
       <w:pPr>
         <w:pStyle w:val="Heading1"/>
@@ -1624,7 +608,47 @@
         <w:rPr>
           <w:color w:val="1A1A1A"/>
         </w:rPr>
-        <w:t>6. Zaman Cizelgesi</w:t>
+        <w:t>Kapsam Disi</w:t>
+      </w:r>
+    </w:p>
+    <w:p>
+      <w:r>
+        <w:rPr>
+          <w:b/>
+        </w:rPr>
+        <w:t xml:space="preserve">Sea-Level Monitoring: </w:t>
+      </w:r>
+      <w:r>
+        <w:t>Drone kamerasi ile hassas deniz seviyesi olcumu fiziksel olarak mumkun degildir. Tide gauge sensoru gereklidir. Gorsel yaklasik tespit alternatif olarak sunulabilir.</w:t>
+      </w:r>
+    </w:p>
+    <w:p/>
+    <w:p>
+      <w:pPr>
+        <w:pStyle w:val="Heading1"/>
+      </w:pPr>
+      <w:r>
+        <w:rPr>
+          <w:color w:val="1A1A1A"/>
+        </w:rPr>
+        <w:t>Ek Oneri: Sabit Kamera Destegi</w:t>
+      </w:r>
+    </w:p>
+    <w:p>
+      <w:r>
+        <w:t>Drone patrolu birincil cozumdur. Ek olarak, sabit kameralar patrol ucuslari arasindaki bosluklari kapatmak icin kritik noktalarda tamamlayici katman olarak devreye girebilir. BBA'nin AI sunucusu her iki kaynagi da ayni altyapi uzerinden isleyebilir.</w:t>
+      </w:r>
+    </w:p>
+    <w:p/>
+    <w:p>
+      <w:pPr>
+        <w:pStyle w:val="Heading1"/>
+      </w:pPr>
+      <w:r>
+        <w:rPr>
+          <w:color w:val="1A1A1A"/>
+        </w:rPr>
+        <w:t>Zaman Cizelgesi</w:t>
       </w:r>
     </w:p>
     <w:tbl>
@@ -1635,14 +659,13 @@
         <w:tblLook w:firstColumn="1" w:firstRow="1" w:lastColumn="0" w:lastRow="0" w:noHBand="0" w:noVBand="1" w:val="04A0"/>
       </w:tblPr>
       <w:tblGrid>
-        <w:gridCol w:w="3135"/>
-        <w:gridCol w:w="3135"/>
-        <w:gridCol w:w="3135"/>
+        <w:gridCol w:w="4703"/>
+        <w:gridCol w:w="4703"/>
       </w:tblGrid>
       <w:tr>
         <w:tc>
           <w:tcPr>
-            <w:tcW w:type="dxa" w:w="3135"/>
+            <w:tcW w:type="dxa" w:w="4703"/>
             <w:shd w:fill="1A1A2A" w:val="clear"/>
           </w:tcPr>
           <w:p>
@@ -1659,7 +682,7 @@
         </w:tc>
         <w:tc>
           <w:tcPr>
-            <w:tcW w:type="dxa" w:w="3135"/>
+            <w:tcW w:type="dxa" w:w="4703"/>
             <w:shd w:fill="1A1A2A" w:val="clear"/>
           </w:tcPr>
           <w:p>
@@ -1674,20 +697,33 @@
             </w:r>
           </w:p>
         </w:tc>
+      </w:tr>
+      <w:tr>
         <w:tc>
           <w:tcPr>
-            <w:tcW w:type="dxa" w:w="3135"/>
-            <w:shd w:fill="1A1A2A" w:val="clear"/>
+            <w:tcW w:type="dxa" w:w="4703"/>
           </w:tcPr>
           <w:p>
             <w:r/>
             <w:r>
               <w:rPr>
-                <w:b/>
-                <w:color w:val="FFFFFF"/>
                 <w:sz w:val="20"/>
               </w:rPr>
-              <w:t>Icerik</w:t>
+              <w:t>Faz 1 — Detection &amp; Counting</w:t>
+            </w:r>
+          </w:p>
+        </w:tc>
+        <w:tc>
+          <w:tcPr>
+            <w:tcW w:type="dxa" w:w="4703"/>
+          </w:tcPr>
+          <w:p>
+            <w:r/>
+            <w:r>
+              <w:rPr>
+                <w:sz w:val="20"/>
+              </w:rPr>
+              <w:t>Hafta 1-6</w:t>
             </w:r>
           </w:p>
         </w:tc>
@@ -1695,7 +731,7 @@
       <w:tr>
         <w:tc>
           <w:tcPr>
-            <w:tcW w:type="dxa" w:w="3135"/>
+            <w:tcW w:type="dxa" w:w="4703"/>
           </w:tcPr>
           <w:p>
             <w:r/>
@@ -1703,101 +739,13 @@
               <w:rPr>
                 <w:sz w:val="20"/>
               </w:rPr>
-              <w:t>Setup &amp; FH2 Entegrasyon</w:t>
+              <w:t>Faz 2 — Zone Analysis &amp; Anomaly</w:t>
             </w:r>
           </w:p>
         </w:tc>
         <w:tc>
           <w:tcPr>
-            <w:tcW w:type="dxa" w:w="3135"/>
-          </w:tcPr>
-          <w:p>
-            <w:r/>
-            <w:r>
-              <w:rPr>
-                <w:sz w:val="20"/>
-              </w:rPr>
-              <w:t>Hafta 1-3</w:t>
-            </w:r>
-          </w:p>
-        </w:tc>
-        <w:tc>
-          <w:tcPr>
-            <w:tcW w:type="dxa" w:w="3135"/>
-          </w:tcPr>
-          <w:p>
-            <w:r/>
-            <w:r>
-              <w:rPr>
-                <w:sz w:val="20"/>
-              </w:rPr>
-              <w:t>API erisimi, test ortami, adaptor gelistirme</w:t>
-            </w:r>
-          </w:p>
-        </w:tc>
-      </w:tr>
-      <w:tr>
-        <w:tc>
-          <w:tcPr>
-            <w:tcW w:type="dxa" w:w="3135"/>
-          </w:tcPr>
-          <w:p>
-            <w:r/>
-            <w:r>
-              <w:rPr>
-                <w:sz w:val="20"/>
-              </w:rPr>
-              <w:t>Faz 1 - Detection &amp; Counting</w:t>
-            </w:r>
-          </w:p>
-        </w:tc>
-        <w:tc>
-          <w:tcPr>
-            <w:tcW w:type="dxa" w:w="3135"/>
-          </w:tcPr>
-          <w:p>
-            <w:r/>
-            <w:r>
-              <w:rPr>
-                <w:sz w:val="20"/>
-              </w:rPr>
-              <w:t>Hafta 2-6</w:t>
-            </w:r>
-          </w:p>
-        </w:tc>
-        <w:tc>
-          <w:tcPr>
-            <w:tcW w:type="dxa" w:w="3135"/>
-          </w:tcPr>
-          <w:p>
-            <w:r/>
-            <w:r>
-              <w:rPr>
-                <w:sz w:val="20"/>
-              </w:rPr>
-              <w:t>People, vehicle, boat, pet, parking</w:t>
-            </w:r>
-          </w:p>
-        </w:tc>
-      </w:tr>
-      <w:tr>
-        <w:tc>
-          <w:tcPr>
-            <w:tcW w:type="dxa" w:w="3135"/>
-          </w:tcPr>
-          <w:p>
-            <w:r/>
-            <w:r>
-              <w:rPr>
-                <w:sz w:val="20"/>
-              </w:rPr>
-              <w:t>Faz 2 - Zone &amp; Anomaly</w:t>
-            </w:r>
-          </w:p>
-        </w:tc>
-        <w:tc>
-          <w:tcPr>
-            <w:tcW w:type="dxa" w:w="3135"/>
+            <w:tcW w:type="dxa" w:w="4703"/>
           </w:tcPr>
           <w:p>
             <w:r/>
@@ -1809,9 +757,11 @@
             </w:r>
           </w:p>
         </w:tc>
+      </w:tr>
+      <w:tr>
         <w:tc>
           <w:tcPr>
-            <w:tcW w:type="dxa" w:w="3135"/>
+            <w:tcW w:type="dxa" w:w="4703"/>
           </w:tcPr>
           <w:p>
             <w:r/>
@@ -1819,29 +769,13 @@
               <w:rPr>
                 <w:sz w:val="20"/>
               </w:rPr>
-              <w:t>Density, intrusion, anomaly, illegal structure</w:t>
-            </w:r>
-          </w:p>
-        </w:tc>
-      </w:tr>
-      <w:tr>
-        <w:tc>
-          <w:tcPr>
-            <w:tcW w:type="dxa" w:w="3135"/>
-          </w:tcPr>
-          <w:p>
-            <w:r/>
-            <w:r>
-              <w:rPr>
-                <w:sz w:val="20"/>
-              </w:rPr>
-              <w:t>Faz 3 - Advanced Analytics</w:t>
+              <w:t>Faz 3 — Advanced Analytics</w:t>
             </w:r>
           </w:p>
         </w:tc>
         <w:tc>
           <w:tcPr>
-            <w:tcW w:type="dxa" w:w="3135"/>
+            <w:tcW w:type="dxa" w:w="4703"/>
           </w:tcPr>
           <w:p>
             <w:r/>
@@ -1853,9 +787,11 @@
             </w:r>
           </w:p>
         </w:tc>
+      </w:tr>
+      <w:tr>
         <w:tc>
           <w:tcPr>
-            <w:tcW w:type="dxa" w:w="3135"/>
+            <w:tcW w:type="dxa" w:w="4703"/>
           </w:tcPr>
           <w:p>
             <w:r/>
@@ -1863,15 +799,13 @@
               <w:rPr>
                 <w:sz w:val="20"/>
               </w:rPr>
-              <w:t>Change detection, shoreline, coastal inspection</w:t>
+              <w:t>Deployment (2 site)</w:t>
             </w:r>
           </w:p>
         </w:tc>
-      </w:tr>
-      <w:tr>
         <w:tc>
           <w:tcPr>
-            <w:tcW w:type="dxa" w:w="3135"/>
+            <w:tcW w:type="dxa" w:w="4703"/>
           </w:tcPr>
           <w:p>
             <w:r/>
@@ -1879,35 +813,7 @@
               <w:rPr>
                 <w:sz w:val="20"/>
               </w:rPr>
-              <w:t>Deployment</w:t>
-            </w:r>
-          </w:p>
-        </w:tc>
-        <w:tc>
-          <w:tcPr>
-            <w:tcW w:type="dxa" w:w="3135"/>
-          </w:tcPr>
-          <w:p>
-            <w:r/>
-            <w:r>
-              <w:rPr>
-                <w:sz w:val="20"/>
-              </w:rPr>
-              <w:t>Hafta 14-16</w:t>
-            </w:r>
-          </w:p>
-        </w:tc>
-        <w:tc>
-          <w:tcPr>
-            <w:tcW w:type="dxa" w:w="3135"/>
-          </w:tcPr>
-          <w:p>
-            <w:r/>
-            <w:r>
-              <w:rPr>
-                <w:sz w:val="20"/>
-              </w:rPr>
-              <w:t>2 site kurulum, test, kabul</w:t>
+              <w:t>Hafta 12-16</w:t>
             </w:r>
           </w:p>
         </w:tc>
@@ -1919,11 +825,11 @@
         <w:rPr>
           <w:b/>
           <w:color w:val="B8922F"/>
-          <w:sz w:val="24"/>
         </w:rPr>
-        <w:t>Toplam: 12-16 hafta (3-4 ay) | Ilk calisir teslimat: 6. hafta</w:t>
+        <w:t>Toplam: 12-16 hafta | Ilk calisir teslimat: 6. hafta</w:t>
       </w:r>
     </w:p>
+    <w:p/>
     <w:p>
       <w:pPr>
         <w:pStyle w:val="Heading1"/>
@@ -1932,925 +838,67 @@
         <w:rPr>
           <w:color w:val="1A1A1A"/>
         </w:rPr>
-        <w:t>7. Aerosmart'tan Ihtiyaclar</w:t>
-      </w:r>
-    </w:p>
-    <w:tbl>
-      <w:tblPr>
-        <w:tblStyle w:val="TableGrid"/>
-        <w:tblW w:type="auto" w:w="0"/>
-        <w:jc w:val="center"/>
-        <w:tblLook w:firstColumn="1" w:firstRow="1" w:lastColumn="0" w:lastRow="0" w:noHBand="0" w:noVBand="1" w:val="04A0"/>
-      </w:tblPr>
-      <w:tblGrid>
-        <w:gridCol w:w="3135"/>
-        <w:gridCol w:w="3135"/>
-        <w:gridCol w:w="3135"/>
-      </w:tblGrid>
-      <w:tr>
-        <w:tc>
-          <w:tcPr>
-            <w:tcW w:type="dxa" w:w="3135"/>
-            <w:shd w:fill="1A1A2A" w:val="clear"/>
-          </w:tcPr>
-          <w:p>
-            <w:r/>
-            <w:r>
-              <w:rPr>
-                <w:b/>
-                <w:color w:val="FFFFFF"/>
-                <w:sz w:val="20"/>
-              </w:rPr>
-              <w:t>Ihtiyac</w:t>
-            </w:r>
-          </w:p>
-        </w:tc>
-        <w:tc>
-          <w:tcPr>
-            <w:tcW w:type="dxa" w:w="3135"/>
-            <w:shd w:fill="1A1A2A" w:val="clear"/>
-          </w:tcPr>
-          <w:p>
-            <w:r/>
-            <w:r>
-              <w:rPr>
-                <w:b/>
-                <w:color w:val="FFFFFF"/>
-                <w:sz w:val="20"/>
-              </w:rPr>
-              <w:t>Ne Icin</w:t>
-            </w:r>
-          </w:p>
-        </w:tc>
-        <w:tc>
-          <w:tcPr>
-            <w:tcW w:type="dxa" w:w="3135"/>
-            <w:shd w:fill="1A1A2A" w:val="clear"/>
-          </w:tcPr>
-          <w:p>
-            <w:r/>
-            <w:r>
-              <w:rPr>
-                <w:b/>
-                <w:color w:val="FFFFFF"/>
-                <w:sz w:val="20"/>
-              </w:rPr>
-              <w:t>Ne Zaman</w:t>
-            </w:r>
-          </w:p>
-        </w:tc>
-      </w:tr>
-      <w:tr>
-        <w:tc>
-          <w:tcPr>
-            <w:tcW w:type="dxa" w:w="3135"/>
-          </w:tcPr>
-          <w:p>
-            <w:r/>
-            <w:r>
-              <w:rPr>
-                <w:sz w:val="20"/>
-              </w:rPr>
-              <w:t>FH2 Cloud Algorithm API erisimi</w:t>
-            </w:r>
-          </w:p>
-        </w:tc>
-        <w:tc>
-          <w:tcPr>
-            <w:tcW w:type="dxa" w:w="3135"/>
-          </w:tcPr>
-          <w:p>
-            <w:r/>
-            <w:r>
-              <w:rPr>
-                <w:sz w:val="20"/>
-              </w:rPr>
-              <w:t>Entegrasyon gelistirme</w:t>
-            </w:r>
-          </w:p>
-        </w:tc>
-        <w:tc>
-          <w:tcPr>
-            <w:tcW w:type="dxa" w:w="3135"/>
-          </w:tcPr>
-          <w:p>
-            <w:r/>
-            <w:r>
-              <w:rPr>
-                <w:sz w:val="20"/>
-              </w:rPr>
-              <w:t>Hafta 1</w:t>
-            </w:r>
-          </w:p>
-        </w:tc>
-      </w:tr>
-      <w:tr>
-        <w:tc>
-          <w:tcPr>
-            <w:tcW w:type="dxa" w:w="3135"/>
-          </w:tcPr>
-          <w:p>
-            <w:r/>
-            <w:r>
-              <w:rPr>
-                <w:sz w:val="20"/>
-              </w:rPr>
-              <w:t>Dell T2 GPU konfigurasyonu bilgisi</w:t>
-            </w:r>
-          </w:p>
-        </w:tc>
-        <w:tc>
-          <w:tcPr>
-            <w:tcW w:type="dxa" w:w="3135"/>
-          </w:tcPr>
-          <w:p>
-            <w:r/>
-            <w:r>
-              <w:rPr>
-                <w:sz w:val="20"/>
-              </w:rPr>
-              <w:t>Sunucu kapasitesi dogrulama</w:t>
-            </w:r>
-          </w:p>
-        </w:tc>
-        <w:tc>
-          <w:tcPr>
-            <w:tcW w:type="dxa" w:w="3135"/>
-          </w:tcPr>
-          <w:p>
-            <w:r/>
-            <w:r>
-              <w:rPr>
-                <w:sz w:val="20"/>
-              </w:rPr>
-              <w:t>Hafta 1</w:t>
-            </w:r>
-          </w:p>
-        </w:tc>
-      </w:tr>
-      <w:tr>
-        <w:tc>
-          <w:tcPr>
-            <w:tcW w:type="dxa" w:w="3135"/>
-          </w:tcPr>
-          <w:p>
-            <w:r/>
-            <w:r>
-              <w:rPr>
-                <w:sz w:val="20"/>
-              </w:rPr>
-              <w:t>Dell T2'ye uzaktan erisim (SSH)</w:t>
-            </w:r>
-          </w:p>
-        </w:tc>
-        <w:tc>
-          <w:tcPr>
-            <w:tcW w:type="dxa" w:w="3135"/>
-          </w:tcPr>
-          <w:p>
-            <w:r/>
-            <w:r>
-              <w:rPr>
-                <w:sz w:val="20"/>
-              </w:rPr>
-              <w:t>Deployment &amp; test</w:t>
-            </w:r>
-          </w:p>
-        </w:tc>
-        <w:tc>
-          <w:tcPr>
-            <w:tcW w:type="dxa" w:w="3135"/>
-          </w:tcPr>
-          <w:p>
-            <w:r/>
-            <w:r>
-              <w:rPr>
-                <w:sz w:val="20"/>
-              </w:rPr>
-              <w:t>Hafta 2</w:t>
-            </w:r>
-          </w:p>
-        </w:tc>
-      </w:tr>
-      <w:tr>
-        <w:tc>
-          <w:tcPr>
-            <w:tcW w:type="dxa" w:w="3135"/>
-          </w:tcPr>
-          <w:p>
-            <w:r/>
-            <w:r>
-              <w:rPr>
-                <w:sz w:val="20"/>
-              </w:rPr>
-              <w:t>Dock 3 kamera ozellikleri</w:t>
-            </w:r>
-          </w:p>
-        </w:tc>
-        <w:tc>
-          <w:tcPr>
-            <w:tcW w:type="dxa" w:w="3135"/>
-          </w:tcPr>
-          <w:p>
-            <w:r/>
-            <w:r>
-              <w:rPr>
-                <w:sz w:val="20"/>
-              </w:rPr>
-              <w:t>Algoritma optimizasyonu</w:t>
-            </w:r>
-          </w:p>
-        </w:tc>
-        <w:tc>
-          <w:tcPr>
-            <w:tcW w:type="dxa" w:w="3135"/>
-          </w:tcPr>
-          <w:p>
-            <w:r/>
-            <w:r>
-              <w:rPr>
-                <w:sz w:val="20"/>
-              </w:rPr>
-              <w:t>Hafta 2</w:t>
-            </w:r>
-          </w:p>
-        </w:tc>
-      </w:tr>
-      <w:tr>
-        <w:tc>
-          <w:tcPr>
-            <w:tcW w:type="dxa" w:w="3135"/>
-          </w:tcPr>
-          <w:p>
-            <w:r/>
-            <w:r>
-              <w:rPr>
-                <w:sz w:val="20"/>
-              </w:rPr>
-              <w:t>Ornek ucus goruntuleri (video/foto)</w:t>
-            </w:r>
-          </w:p>
-        </w:tc>
-        <w:tc>
-          <w:tcPr>
-            <w:tcW w:type="dxa" w:w="3135"/>
-          </w:tcPr>
-          <w:p>
-            <w:r/>
-            <w:r>
-              <w:rPr>
-                <w:sz w:val="20"/>
-              </w:rPr>
-              <w:t>Model fine-tuning &amp; test</w:t>
-            </w:r>
-          </w:p>
-        </w:tc>
-        <w:tc>
-          <w:tcPr>
-            <w:tcW w:type="dxa" w:w="3135"/>
-          </w:tcPr>
-          <w:p>
-            <w:r/>
-            <w:r>
-              <w:rPr>
-                <w:sz w:val="20"/>
-              </w:rPr>
-              <w:t>Hafta 3</w:t>
-            </w:r>
-          </w:p>
-        </w:tc>
-      </w:tr>
-      <w:tr>
-        <w:tc>
-          <w:tcPr>
-            <w:tcW w:type="dxa" w:w="3135"/>
-          </w:tcPr>
-          <w:p>
-            <w:r/>
-            <w:r>
-              <w:rPr>
-                <w:sz w:val="20"/>
-              </w:rPr>
-              <w:t>Bolge haritalari (zone tanimlari)</w:t>
-            </w:r>
-          </w:p>
-        </w:tc>
-        <w:tc>
-          <w:tcPr>
-            <w:tcW w:type="dxa" w:w="3135"/>
-          </w:tcPr>
-          <w:p>
-            <w:r/>
-            <w:r>
-              <w:rPr>
-                <w:sz w:val="20"/>
-              </w:rPr>
-              <w:t>Zone density &amp; restricted zone</w:t>
-            </w:r>
-          </w:p>
-        </w:tc>
-        <w:tc>
-          <w:tcPr>
-            <w:tcW w:type="dxa" w:w="3135"/>
-          </w:tcPr>
-          <w:p>
-            <w:r/>
-            <w:r>
-              <w:rPr>
-                <w:sz w:val="20"/>
-              </w:rPr>
-              <w:t>Hafta 4</w:t>
-            </w:r>
-          </w:p>
-        </w:tc>
-      </w:tr>
-      <w:tr>
-        <w:tc>
-          <w:tcPr>
-            <w:tcW w:type="dxa" w:w="3135"/>
-          </w:tcPr>
-          <w:p>
-            <w:r/>
-            <w:r>
-              <w:rPr>
-                <w:sz w:val="20"/>
-              </w:rPr>
-              <w:t>Referans/baseline goruntuler</w:t>
-            </w:r>
-          </w:p>
-        </w:tc>
-        <w:tc>
-          <w:tcPr>
-            <w:tcW w:type="dxa" w:w="3135"/>
-          </w:tcPr>
-          <w:p>
-            <w:r/>
-            <w:r>
-              <w:rPr>
-                <w:sz w:val="20"/>
-              </w:rPr>
-              <w:t>Change detection &amp; shoreline</w:t>
-            </w:r>
-          </w:p>
-        </w:tc>
-        <w:tc>
-          <w:tcPr>
-            <w:tcW w:type="dxa" w:w="3135"/>
-          </w:tcPr>
-          <w:p>
-            <w:r/>
-            <w:r>
-              <w:rPr>
-                <w:sz w:val="20"/>
-              </w:rPr>
-              <w:t>Hafta 8</w:t>
-            </w:r>
-          </w:p>
-        </w:tc>
-      </w:tr>
-      <w:tr>
-        <w:tc>
-          <w:tcPr>
-            <w:tcW w:type="dxa" w:w="3135"/>
-          </w:tcPr>
-          <w:p>
-            <w:r/>
-            <w:r>
-              <w:rPr>
-                <w:sz w:val="20"/>
-              </w:rPr>
-              <w:t>Site'lara fiziksel erisim</w:t>
-            </w:r>
-          </w:p>
-        </w:tc>
-        <w:tc>
-          <w:tcPr>
-            <w:tcW w:type="dxa" w:w="3135"/>
-          </w:tcPr>
-          <w:p>
-            <w:r/>
-            <w:r>
-              <w:rPr>
-                <w:sz w:val="20"/>
-              </w:rPr>
-              <w:t>Final kurulum</w:t>
-            </w:r>
-          </w:p>
-        </w:tc>
-        <w:tc>
-          <w:tcPr>
-            <w:tcW w:type="dxa" w:w="3135"/>
-          </w:tcPr>
-          <w:p>
-            <w:r/>
-            <w:r>
-              <w:rPr>
-                <w:sz w:val="20"/>
-              </w:rPr>
-              <w:t>Hafta 14</w:t>
-            </w:r>
-          </w:p>
-        </w:tc>
-      </w:tr>
-    </w:tbl>
-    <w:p>
-      <w:pPr>
-        <w:pStyle w:val="Heading1"/>
-      </w:pPr>
-      <w:r>
-        <w:rPr>
-          <w:color w:val="1A1A1A"/>
-        </w:rPr>
-        <w:t>8. Teslimatlar</w:t>
-      </w:r>
-    </w:p>
-    <w:p>
-      <w:pPr>
-        <w:pStyle w:val="Heading2"/>
-      </w:pPr>
-      <w:r>
-        <w:rPr>
-          <w:color w:val="B8922F"/>
-        </w:rPr>
-        <w:t>Her Faz Sonunda:</w:t>
-      </w:r>
-    </w:p>
-    <w:p>
-      <w:pPr>
-        <w:pStyle w:val="ListBullet"/>
-      </w:pPr>
-      <w:r>
-        <w:t>Calisir inference sunucusu (Docker container)</w:t>
-      </w:r>
-    </w:p>
-    <w:p>
-      <w:pPr>
-        <w:pStyle w:val="ListBullet"/>
-      </w:pPr>
-      <w:r>
-        <w:t>Flight Hub 2 entegrasyonu veya BBA Dashboard ile gercek zamanli alert'ler</w:t>
-      </w:r>
-    </w:p>
-    <w:p>
-      <w:pPr>
-        <w:pStyle w:val="ListBullet"/>
-      </w:pPr>
-      <w:r>
-        <w:t>Performans raporu (FPS, dogruluk, false positive orani)</w:t>
-      </w:r>
-    </w:p>
-    <w:p>
-      <w:pPr>
-        <w:pStyle w:val="ListBullet"/>
-      </w:pPr>
-      <w:r>
-        <w:t>Kullanim &amp; bakim dokumantasyonu</w:t>
-      </w:r>
-    </w:p>
-    <w:p>
-      <w:pPr>
-        <w:pStyle w:val="Heading2"/>
-      </w:pPr>
-      <w:r>
-        <w:rPr>
-          <w:color w:val="B8922F"/>
-        </w:rPr>
-        <w:t>Proje Sonunda:</w:t>
-      </w:r>
-    </w:p>
-    <w:p>
-      <w:pPr>
-        <w:pStyle w:val="ListBullet"/>
-      </w:pPr>
-      <w:r>
-        <w:t>2 site'a deploy edilmis, calisir AI sistemi</w:t>
-      </w:r>
-    </w:p>
-    <w:p>
-      <w:pPr>
-        <w:pStyle w:val="ListBullet"/>
-      </w:pPr>
-      <w:r>
-        <w:t>Tum use case'ler icin egitilmis ve optimize edilmis modeller</w:t>
-      </w:r>
-    </w:p>
-    <w:p>
-      <w:pPr>
-        <w:pStyle w:val="ListBullet"/>
-      </w:pPr>
-      <w:r>
-        <w:t>Kaynak kodu &amp; model dosyalari teslimi</w:t>
-      </w:r>
-    </w:p>
-    <w:p>
-      <w:pPr>
-        <w:pStyle w:val="ListBullet"/>
-      </w:pPr>
-      <w:r>
-        <w:t>Deployment sonrasi 3 ay teknik destek</w:t>
-      </w:r>
-    </w:p>
-    <w:p>
-      <w:pPr>
-        <w:pStyle w:val="ListBullet"/>
-      </w:pPr>
-      <w:r>
-        <w:t>Uzaktan veya sahada kurulum destegi</w:t>
-      </w:r>
-    </w:p>
-    <w:p>
-      <w:pPr>
-        <w:pStyle w:val="Heading1"/>
-      </w:pPr>
-      <w:r>
-        <w:rPr>
-          <w:color w:val="1A1A1A"/>
-        </w:rPr>
-        <w:t>9. Dell T2 Sunucu Gereksinimleri</w:t>
-      </w:r>
-    </w:p>
-    <w:tbl>
-      <w:tblPr>
-        <w:tblStyle w:val="TableGrid"/>
-        <w:tblW w:type="auto" w:w="0"/>
-        <w:jc w:val="center"/>
-        <w:tblLook w:firstColumn="1" w:firstRow="1" w:lastColumn="0" w:lastRow="0" w:noHBand="0" w:noVBand="1" w:val="04A0"/>
-      </w:tblPr>
-      <w:tblGrid>
-        <w:gridCol w:w="3135"/>
-        <w:gridCol w:w="3135"/>
-        <w:gridCol w:w="3135"/>
-      </w:tblGrid>
-      <w:tr>
-        <w:tc>
-          <w:tcPr>
-            <w:tcW w:type="dxa" w:w="3135"/>
-            <w:shd w:fill="1A1A2A" w:val="clear"/>
-          </w:tcPr>
-          <w:p>
-            <w:r/>
-            <w:r>
-              <w:rPr>
-                <w:b/>
-                <w:color w:val="FFFFFF"/>
-                <w:sz w:val="20"/>
-              </w:rPr>
-              <w:t>Bilesen</w:t>
-            </w:r>
-          </w:p>
-        </w:tc>
-        <w:tc>
-          <w:tcPr>
-            <w:tcW w:type="dxa" w:w="3135"/>
-            <w:shd w:fill="1A1A2A" w:val="clear"/>
-          </w:tcPr>
-          <w:p>
-            <w:r/>
-            <w:r>
-              <w:rPr>
-                <w:b/>
-                <w:color w:val="FFFFFF"/>
-                <w:sz w:val="20"/>
-              </w:rPr>
-              <w:t>Minimum</w:t>
-            </w:r>
-          </w:p>
-        </w:tc>
-        <w:tc>
-          <w:tcPr>
-            <w:tcW w:type="dxa" w:w="3135"/>
-            <w:shd w:fill="1A1A2A" w:val="clear"/>
-          </w:tcPr>
-          <w:p>
-            <w:r/>
-            <w:r>
-              <w:rPr>
-                <w:b/>
-                <w:color w:val="FFFFFF"/>
-                <w:sz w:val="20"/>
-              </w:rPr>
-              <w:t>Onerilen</w:t>
-            </w:r>
-          </w:p>
-        </w:tc>
-      </w:tr>
-      <w:tr>
-        <w:tc>
-          <w:tcPr>
-            <w:tcW w:type="dxa" w:w="3135"/>
-          </w:tcPr>
-          <w:p>
-            <w:r/>
-            <w:r>
-              <w:rPr>
-                <w:sz w:val="20"/>
-              </w:rPr>
-              <w:t>GPU</w:t>
-            </w:r>
-          </w:p>
-        </w:tc>
-        <w:tc>
-          <w:tcPr>
-            <w:tcW w:type="dxa" w:w="3135"/>
-          </w:tcPr>
-          <w:p>
-            <w:r/>
-            <w:r>
-              <w:rPr>
-                <w:sz w:val="20"/>
-              </w:rPr>
-              <w:t>NVIDIA RTX 2000 Ada</w:t>
-            </w:r>
-          </w:p>
-        </w:tc>
-        <w:tc>
-          <w:tcPr>
-            <w:tcW w:type="dxa" w:w="3135"/>
-          </w:tcPr>
-          <w:p>
-            <w:r/>
-            <w:r>
-              <w:rPr>
-                <w:sz w:val="20"/>
-              </w:rPr>
-              <w:t>NVIDIA RTX 4000 Ada veya ustu</w:t>
-            </w:r>
-          </w:p>
-        </w:tc>
-      </w:tr>
-      <w:tr>
-        <w:tc>
-          <w:tcPr>
-            <w:tcW w:type="dxa" w:w="3135"/>
-          </w:tcPr>
-          <w:p>
-            <w:r/>
-            <w:r>
-              <w:rPr>
-                <w:sz w:val="20"/>
-              </w:rPr>
-              <w:t>RAM</w:t>
-            </w:r>
-          </w:p>
-        </w:tc>
-        <w:tc>
-          <w:tcPr>
-            <w:tcW w:type="dxa" w:w="3135"/>
-          </w:tcPr>
-          <w:p>
-            <w:r/>
-            <w:r>
-              <w:rPr>
-                <w:sz w:val="20"/>
-              </w:rPr>
-              <w:t>32 GB</w:t>
-            </w:r>
-          </w:p>
-        </w:tc>
-        <w:tc>
-          <w:tcPr>
-            <w:tcW w:type="dxa" w:w="3135"/>
-          </w:tcPr>
-          <w:p>
-            <w:r/>
-            <w:r>
-              <w:rPr>
-                <w:sz w:val="20"/>
-              </w:rPr>
-              <w:t>64 GB</w:t>
-            </w:r>
-          </w:p>
-        </w:tc>
-      </w:tr>
-      <w:tr>
-        <w:tc>
-          <w:tcPr>
-            <w:tcW w:type="dxa" w:w="3135"/>
-          </w:tcPr>
-          <w:p>
-            <w:r/>
-            <w:r>
-              <w:rPr>
-                <w:sz w:val="20"/>
-              </w:rPr>
-              <w:t>Storage</w:t>
-            </w:r>
-          </w:p>
-        </w:tc>
-        <w:tc>
-          <w:tcPr>
-            <w:tcW w:type="dxa" w:w="3135"/>
-          </w:tcPr>
-          <w:p>
-            <w:r/>
-            <w:r>
-              <w:rPr>
-                <w:sz w:val="20"/>
-              </w:rPr>
-              <w:t>500 GB SSD</w:t>
-            </w:r>
-          </w:p>
-        </w:tc>
-        <w:tc>
-          <w:tcPr>
-            <w:tcW w:type="dxa" w:w="3135"/>
-          </w:tcPr>
-          <w:p>
-            <w:r/>
-            <w:r>
-              <w:rPr>
-                <w:sz w:val="20"/>
-              </w:rPr>
-              <w:t>1 TB NVMe SSD</w:t>
-            </w:r>
-          </w:p>
-        </w:tc>
-      </w:tr>
-      <w:tr>
-        <w:tc>
-          <w:tcPr>
-            <w:tcW w:type="dxa" w:w="3135"/>
-          </w:tcPr>
-          <w:p>
-            <w:r/>
-            <w:r>
-              <w:rPr>
-                <w:sz w:val="20"/>
-              </w:rPr>
-              <w:t>OS</w:t>
-            </w:r>
-          </w:p>
-        </w:tc>
-        <w:tc>
-          <w:tcPr>
-            <w:tcW w:type="dxa" w:w="3135"/>
-          </w:tcPr>
-          <w:p>
-            <w:r/>
-            <w:r>
-              <w:rPr>
-                <w:sz w:val="20"/>
-              </w:rPr>
-              <w:t>Ubuntu 22.04 LTS</w:t>
-            </w:r>
-          </w:p>
-        </w:tc>
-        <w:tc>
-          <w:tcPr>
-            <w:tcW w:type="dxa" w:w="3135"/>
-          </w:tcPr>
-          <w:p>
-            <w:r/>
-            <w:r>
-              <w:rPr>
-                <w:sz w:val="20"/>
-              </w:rPr>
-              <w:t>Ubuntu 22.04 LTS</w:t>
-            </w:r>
-          </w:p>
-        </w:tc>
-      </w:tr>
-      <w:tr>
-        <w:tc>
-          <w:tcPr>
-            <w:tcW w:type="dxa" w:w="3135"/>
-          </w:tcPr>
-          <w:p>
-            <w:r/>
-            <w:r>
-              <w:rPr>
-                <w:sz w:val="20"/>
-              </w:rPr>
-              <w:t>CUDA</w:t>
-            </w:r>
-          </w:p>
-        </w:tc>
-        <w:tc>
-          <w:tcPr>
-            <w:tcW w:type="dxa" w:w="3135"/>
-          </w:tcPr>
-          <w:p>
-            <w:r/>
-            <w:r>
-              <w:rPr>
-                <w:sz w:val="20"/>
-              </w:rPr>
-              <w:t>12.0+</w:t>
-            </w:r>
-          </w:p>
-        </w:tc>
-        <w:tc>
-          <w:tcPr>
-            <w:tcW w:type="dxa" w:w="3135"/>
-          </w:tcPr>
-          <w:p>
-            <w:r/>
-            <w:r>
-              <w:rPr>
-                <w:sz w:val="20"/>
-              </w:rPr>
-              <w:t>12.0+</w:t>
-            </w:r>
-          </w:p>
-        </w:tc>
-      </w:tr>
-    </w:tbl>
-    <w:p/>
-    <w:p>
-      <w:r>
-        <w:t>Not: DJI'in kendi FlightHub 2 AIO donanimi RTX 2000 Ada kullanmaktadir. Eszamanli birden fazla AI modeli calistirmak icin RTX 4000 Ada onerilir. GPU konfigurasyonu proje baslangicinda dogrulanmalidir.</w:t>
+        <w:t>Sonraki Adimlar</w:t>
       </w:r>
     </w:p>
     <w:p>
       <w:r>
-        <w:br w:type="page"/>
+        <w:t>1. Flight Hub 2 Cloud Algorithm API erisimi ve dokumantasyonu</w:t>
+      </w:r>
+    </w:p>
+    <w:p>
+      <w:r>
+        <w:t>2. Dell T2 GPU konfigurasyonu dogrulamasi</w:t>
+      </w:r>
+    </w:p>
+    <w:p>
+      <w:r>
+        <w:t>3. Ornek ucus goruntuleri (model test icin)</w:t>
+      </w:r>
+    </w:p>
+    <w:p>
+      <w:r>
+        <w:t>4. Detayli teknik sunum ve fiyatlandirma gorusmesi</w:t>
       </w:r>
     </w:p>
     <w:p/>
     <w:p/>
-    <w:p/>
-    <w:p/>
-    <w:p/>
-    <w:p/>
-    <w:p/>
-    <w:p/>
     <w:p>
       <w:pPr>
-        <w:jc w:val="center"/>
+        <w:jc w:val="left"/>
       </w:pPr>
       <w:r>
         <w:rPr>
           <w:b/>
-          <w:color w:val="B8922F"/>
-          <w:sz w:val="56"/>
-        </w:rPr>
-        <w:t>BBA TEKNOLOJi</w:t>
-      </w:r>
-    </w:p>
-    <w:p>
-      <w:pPr>
-        <w:jc w:val="center"/>
-      </w:pPr>
-      <w:r>
-        <w:rPr>
-          <w:color w:val="666666"/>
-          <w:sz w:val="28"/>
-        </w:rPr>
-        <w:t>Drone AI &amp; Computer Vision Solutions</w:t>
-      </w:r>
-    </w:p>
-    <w:p/>
-    <w:p>
-      <w:pPr>
-        <w:jc w:val="center"/>
-      </w:pPr>
-      <w:r>
-        <w:rPr>
-          <w:b/>
-          <w:sz w:val="28"/>
+          <w:sz w:val="24"/>
         </w:rPr>
         <w:t>Serdar Batkan</w:t>
       </w:r>
     </w:p>
     <w:p>
-      <w:pPr>
-        <w:jc w:val="center"/>
-      </w:pPr>
       <w:r>
         <w:rPr>
           <w:color w:val="B8922F"/>
-          <w:sz w:val="24"/>
+          <w:sz w:val="22"/>
+        </w:rPr>
+        <w:t>BBA Teknoloji</w:t>
+      </w:r>
+    </w:p>
+    <w:p>
+      <w:r>
+        <w:rPr>
+          <w:sz w:val="22"/>
         </w:rPr>
         <w:t>serdarbatkan@bbateknoloji.com</w:t>
       </w:r>
     </w:p>
     <w:p>
-      <w:pPr>
-        <w:jc w:val="center"/>
-      </w:pPr>
       <w:r>
         <w:rPr>
           <w:color w:val="666666"/>
-          <w:sz w:val="24"/>
+          <w:sz w:val="22"/>
         </w:rPr>
         <w:t>+90 534 431 87 34</w:t>
-      </w:r>
-    </w:p>
-    <w:p/>
-    <w:p/>
-    <w:p/>
-    <w:p/>
-    <w:p>
-      <w:pPr>
-        <w:jc w:val="center"/>
-      </w:pPr>
-      <w:r>
-        <w:rPr>
-          <w:i/>
-          <w:color w:val="AAAAAA"/>
-          <w:sz w:val="18"/>
-        </w:rPr>
-        <w:t>This document is confidential and intended solely for the use of Aerosmart.</w:t>
       </w:r>
     </w:p>
     <w:sectPr>

</xml_diff>

<commit_message>
12-week timeline, deploy per phase, no technical names
</commit_message>
<xml_diff>
--- a/BBA_Aerosmart_Proposal.docx
+++ b/BBA_Aerosmart_Proposal.docx
@@ -134,7 +134,7 @@
           <w:b/>
           <w:color w:val="B8922F"/>
         </w:rPr>
-        <w:t>Tahmini sure: 12-16 hafta | Ilk teslimat: 6. hafta</w:t>
+        <w:t>Toplam sure: 12 hafta | Her faz tamamlandikca deploy edilir</w:t>
       </w:r>
     </w:p>
     <w:p/>
@@ -723,7 +723,7 @@
               <w:rPr>
                 <w:sz w:val="20"/>
               </w:rPr>
-              <w:t>Hafta 1-6</w:t>
+              <w:t>Hafta 1-4 → Deploy</w:t>
             </w:r>
           </w:p>
         </w:tc>
@@ -753,7 +753,7 @@
               <w:rPr>
                 <w:sz w:val="20"/>
               </w:rPr>
-              <w:t>Hafta 4-10</w:t>
+              <w:t>Hafta 4-8 → Deploy</w:t>
             </w:r>
           </w:p>
         </w:tc>
@@ -783,37 +783,7 @@
               <w:rPr>
                 <w:sz w:val="20"/>
               </w:rPr>
-              <w:t>Hafta 8-14</w:t>
-            </w:r>
-          </w:p>
-        </w:tc>
-      </w:tr>
-      <w:tr>
-        <w:tc>
-          <w:tcPr>
-            <w:tcW w:type="dxa" w:w="4703"/>
-          </w:tcPr>
-          <w:p>
-            <w:r/>
-            <w:r>
-              <w:rPr>
-                <w:sz w:val="20"/>
-              </w:rPr>
-              <w:t>Deployment (2 site)</w:t>
-            </w:r>
-          </w:p>
-        </w:tc>
-        <w:tc>
-          <w:tcPr>
-            <w:tcW w:type="dxa" w:w="4703"/>
-          </w:tcPr>
-          <w:p>
-            <w:r/>
-            <w:r>
-              <w:rPr>
-                <w:sz w:val="20"/>
-              </w:rPr>
-              <w:t>Hafta 12-16</w:t>
+              <w:t>Hafta 7-12 → Deploy</w:t>
             </w:r>
           </w:p>
         </w:tc>
@@ -826,7 +796,7 @@
           <w:b/>
           <w:color w:val="B8922F"/>
         </w:rPr>
-        <w:t>Toplam: 12-16 hafta | Ilk calisir teslimat: 6. hafta</w:t>
+        <w:t>Toplam: 12 hafta | Her faz bittikce deploy edilir, bekleme yok.</w:t>
       </w:r>
     </w:p>
     <w:p/>

</xml_diff>

<commit_message>
Final: full English, 12-week deploy-per-phase, timeline negotiable
</commit_message>
<xml_diff>
--- a/BBA_Aerosmart_Proposal.docx
+++ b/BBA_Aerosmart_Proposal.docx
@@ -109,12 +109,12 @@
     </w:p>
     <w:p>
       <w:r>
-        <w:t>BBA Teknoloji, Aerosmart'in Flight Hub 2 (on-premises) + Dock 3 altyapisi uzerine AI algoritmalari gelistirmeyi ve Dell T2 uzerinde deploy etmeyi teklif etmektedir.</w:t>
+        <w:t>BBA Teknoloji proposes to develop custom AI algorithms for Aerosmart's Flight Hub 2 (on-premises) + Dock 3 infrastructure, deployed on Dell T2 as an inference server.</w:t>
       </w:r>
     </w:p>
     <w:p>
       <w:r>
-        <w:t>Flight Hub 2'nin Cloud Algorithm arayuzunun ucuncu parti algoritmalara acik oldugunu tespit ettik. BBA algoritmalari dogrudan FH2 platformuna entegre edilebilir.</w:t>
+        <w:t>Our technical research confirms that Flight Hub 2's Cloud Algorithm interface is open to third-party algorithms. BBA's AI algorithms can be directly integrated into the FH2 platform, with results displayed in real-time on the FH2 dashboard.</w:t>
       </w:r>
     </w:p>
     <w:p>
@@ -122,10 +122,10 @@
         <w:rPr>
           <w:b/>
         </w:rPr>
-        <w:t xml:space="preserve">Kapsam: </w:t>
+        <w:t xml:space="preserve">Scope: </w:t>
       </w:r>
       <w:r>
-        <w:t>Yalnizca AI algoritma gelistirme ve deployment. Ucus operasyonu Aerosmart'ta kalir.</w:t>
+        <w:t>AI algorithm development and deployment only. Flight operations remain with Aerosmart.</w:t>
       </w:r>
     </w:p>
     <w:p>
@@ -134,7 +134,7 @@
           <w:b/>
           <w:color w:val="B8922F"/>
         </w:rPr>
-        <w:t>Toplam sure: 12 hafta | Her faz tamamlandikca deploy edilir</w:t>
+        <w:t>Total duration: 12 weeks | Each phase deployed as completed.</w:t>
       </w:r>
     </w:p>
     <w:p/>
@@ -146,7 +146,7 @@
         <w:rPr>
           <w:color w:val="1A1A1A"/>
         </w:rPr>
-        <w:t>Sunabilecegimiz Cozumler</w:t>
+        <w:t>Solutions We Can Deliver</w:t>
       </w:r>
     </w:p>
     <w:tbl>
@@ -191,7 +191,7 @@
                 <w:color w:val="FFFFFF"/>
                 <w:sz w:val="20"/>
               </w:rPr>
-              <w:t>Faz</w:t>
+              <w:t>Phase</w:t>
             </w:r>
           </w:p>
         </w:tc>
@@ -221,7 +221,7 @@
               <w:rPr>
                 <w:sz w:val="20"/>
               </w:rPr>
-              <w:t>Faz 1</w:t>
+              <w:t>Phase 1</w:t>
             </w:r>
           </w:p>
         </w:tc>
@@ -251,7 +251,7 @@
               <w:rPr>
                 <w:sz w:val="20"/>
               </w:rPr>
-              <w:t>Faz 1</w:t>
+              <w:t>Phase 1</w:t>
             </w:r>
           </w:p>
         </w:tc>
@@ -281,7 +281,7 @@
               <w:rPr>
                 <w:sz w:val="20"/>
               </w:rPr>
-              <w:t>Faz 1</w:t>
+              <w:t>Phase 1</w:t>
             </w:r>
           </w:p>
         </w:tc>
@@ -311,7 +311,7 @@
               <w:rPr>
                 <w:sz w:val="20"/>
               </w:rPr>
-              <w:t>Faz 1</w:t>
+              <w:t>Phase 1</w:t>
             </w:r>
           </w:p>
         </w:tc>
@@ -341,7 +341,7 @@
               <w:rPr>
                 <w:sz w:val="20"/>
               </w:rPr>
-              <w:t>Faz 1</w:t>
+              <w:t>Phase 1</w:t>
             </w:r>
           </w:p>
         </w:tc>
@@ -371,7 +371,7 @@
               <w:rPr>
                 <w:sz w:val="20"/>
               </w:rPr>
-              <w:t>Faz 2</w:t>
+              <w:t>Phase 2</w:t>
             </w:r>
           </w:p>
         </w:tc>
@@ -401,7 +401,7 @@
               <w:rPr>
                 <w:sz w:val="20"/>
               </w:rPr>
-              <w:t>Faz 2</w:t>
+              <w:t>Phase 2</w:t>
             </w:r>
           </w:p>
         </w:tc>
@@ -431,7 +431,7 @@
               <w:rPr>
                 <w:sz w:val="20"/>
               </w:rPr>
-              <w:t>Faz 2</w:t>
+              <w:t>Phase 2</w:t>
             </w:r>
           </w:p>
         </w:tc>
@@ -461,7 +461,7 @@
               <w:rPr>
                 <w:sz w:val="20"/>
               </w:rPr>
-              <w:t>Faz 2</w:t>
+              <w:t>Phase 2</w:t>
             </w:r>
           </w:p>
         </w:tc>
@@ -491,7 +491,7 @@
               <w:rPr>
                 <w:sz w:val="20"/>
               </w:rPr>
-              <w:t>Faz 3</w:t>
+              <w:t>Phase 3</w:t>
             </w:r>
           </w:p>
         </w:tc>
@@ -521,7 +521,7 @@
               <w:rPr>
                 <w:sz w:val="20"/>
               </w:rPr>
-              <w:t>Faz 3</w:t>
+              <w:t>Phase 3</w:t>
             </w:r>
           </w:p>
         </w:tc>
@@ -551,7 +551,7 @@
               <w:rPr>
                 <w:sz w:val="20"/>
               </w:rPr>
-              <w:t>Faz 3</w:t>
+              <w:t>Phase 3</w:t>
             </w:r>
           </w:p>
         </w:tc>
@@ -581,7 +581,7 @@
               <w:rPr>
                 <w:sz w:val="20"/>
               </w:rPr>
-              <w:t>Faz 3</w:t>
+              <w:t>Phase 3</w:t>
             </w:r>
           </w:p>
         </w:tc>
@@ -596,7 +596,7 @@
         <w:t xml:space="preserve">* Coastal Inspection: </w:t>
       </w:r>
       <w:r>
-        <w:t>Gorsel anomali tespiti yapilabilir. Muhendislik seviyesinde yapisal analiz kapsam disindadir.</w:t>
+        <w:t>Visual anomaly detection is feasible. Engineering-grade structural analysis is out of scope.</w:t>
       </w:r>
     </w:p>
     <w:p/>
@@ -608,7 +608,7 @@
         <w:rPr>
           <w:color w:val="1A1A1A"/>
         </w:rPr>
-        <w:t>Kapsam Disi</w:t>
+        <w:t>Out of Scope</w:t>
       </w:r>
     </w:p>
     <w:p>
@@ -619,7 +619,7 @@
         <w:t xml:space="preserve">Sea-Level Monitoring: </w:t>
       </w:r>
       <w:r>
-        <w:t>Drone kamerasi ile hassas deniz seviyesi olcumu fiziksel olarak mumkun degildir. Tide gauge sensoru gereklidir. Gorsel yaklasik tespit alternatif olarak sunulabilir.</w:t>
+        <w:t>Precision sea level measurement via drone camera is physically not feasible. Requires tide gauge sensors. Approximate visual detection can be offered as an alternative.</w:t>
       </w:r>
     </w:p>
     <w:p/>
@@ -631,12 +631,12 @@
         <w:rPr>
           <w:color w:val="1A1A1A"/>
         </w:rPr>
-        <w:t>Ek Oneri: Sabit Kamera Destegi</w:t>
+        <w:t>Additional Value: Fixed Camera Support</w:t>
       </w:r>
     </w:p>
     <w:p>
       <w:r>
-        <w:t>Drone patrolu birincil cozumdur. Ek olarak, sabit kameralar patrol ucuslari arasindaki bosluklari kapatmak icin kritik noktalarda tamamlayici katman olarak devreye girebilir. BBA'nin AI sunucusu her iki kaynagi da ayni altyapi uzerinden isleyebilir.</w:t>
+        <w:t>Drone patrol is the primary solution. Additionally, fixed cameras can serve as a complementary layer to fill coverage gaps between patrol flights at critical points. BBA's AI server can process both sources through the same inference engine.</w:t>
       </w:r>
     </w:p>
     <w:p/>
@@ -648,7 +648,7 @@
         <w:rPr>
           <w:color w:val="1A1A1A"/>
         </w:rPr>
-        <w:t>Zaman Cizelgesi</w:t>
+        <w:t>Timeline</w:t>
       </w:r>
     </w:p>
     <w:tbl>
@@ -676,7 +676,7 @@
                 <w:color w:val="FFFFFF"/>
                 <w:sz w:val="20"/>
               </w:rPr>
-              <w:t>Faz</w:t>
+              <w:t>Phase</w:t>
             </w:r>
           </w:p>
         </w:tc>
@@ -693,7 +693,7 @@
                 <w:color w:val="FFFFFF"/>
                 <w:sz w:val="20"/>
               </w:rPr>
-              <w:t>Sure</w:t>
+              <w:t>Duration</w:t>
             </w:r>
           </w:p>
         </w:tc>
@@ -709,7 +709,7 @@
               <w:rPr>
                 <w:sz w:val="20"/>
               </w:rPr>
-              <w:t>Faz 1 — Detection &amp; Counting</w:t>
+              <w:t>Phase 1 — Detection &amp; Counting</w:t>
             </w:r>
           </w:p>
         </w:tc>
@@ -723,7 +723,7 @@
               <w:rPr>
                 <w:sz w:val="20"/>
               </w:rPr>
-              <w:t>Hafta 1-4 → Deploy</w:t>
+              <w:t>Week 1-4 → Deploy</w:t>
             </w:r>
           </w:p>
         </w:tc>
@@ -739,7 +739,7 @@
               <w:rPr>
                 <w:sz w:val="20"/>
               </w:rPr>
-              <w:t>Faz 2 — Zone Analysis &amp; Anomaly</w:t>
+              <w:t>Phase 2 — Zone Analysis &amp; Anomaly</w:t>
             </w:r>
           </w:p>
         </w:tc>
@@ -753,7 +753,7 @@
               <w:rPr>
                 <w:sz w:val="20"/>
               </w:rPr>
-              <w:t>Hafta 4-8 → Deploy</w:t>
+              <w:t>Week 4-8 → Deploy</w:t>
             </w:r>
           </w:p>
         </w:tc>
@@ -769,7 +769,7 @@
               <w:rPr>
                 <w:sz w:val="20"/>
               </w:rPr>
-              <w:t>Faz 3 — Advanced Analytics</w:t>
+              <w:t>Phase 3 — Advanced Analytics</w:t>
             </w:r>
           </w:p>
         </w:tc>
@@ -783,7 +783,7 @@
               <w:rPr>
                 <w:sz w:val="20"/>
               </w:rPr>
-              <w:t>Hafta 7-12 → Deploy</w:t>
+              <w:t>Week 7-12 → Deploy</w:t>
             </w:r>
           </w:p>
         </w:tc>
@@ -796,7 +796,7 @@
           <w:b/>
           <w:color w:val="B8922F"/>
         </w:rPr>
-        <w:t>Toplam: 12 hafta | Her faz bittikce deploy edilir, bekleme yok.</w:t>
+        <w:t>Total: 12 weeks | Each phase deployed as completed. Timeline is negotiable.</w:t>
       </w:r>
     </w:p>
     <w:p/>
@@ -808,27 +808,27 @@
         <w:rPr>
           <w:color w:val="1A1A1A"/>
         </w:rPr>
-        <w:t>Sonraki Adimlar</w:t>
+        <w:t>Next Steps</w:t>
       </w:r>
     </w:p>
     <w:p>
       <w:r>
-        <w:t>1. Flight Hub 2 Cloud Algorithm API erisimi ve dokumantasyonu</w:t>
+        <w:t>1. Flight Hub 2 Cloud Algorithm API access and documentation</w:t>
       </w:r>
     </w:p>
     <w:p>
       <w:r>
-        <w:t>2. Dell T2 GPU konfigurasyonu dogrulamasi</w:t>
+        <w:t>2. Dell T2 GPU configuration confirmation</w:t>
       </w:r>
     </w:p>
     <w:p>
       <w:r>
-        <w:t>3. Ornek ucus goruntuleri (model test icin)</w:t>
+        <w:t>3. Sample flight footage (for model testing)</w:t>
       </w:r>
     </w:p>
     <w:p>
       <w:r>
-        <w:t>4. Detayli teknik sunum ve fiyatlandirma gorusmesi</w:t>
+        <w:t>4. Detailed technical presentation and pricing discussion</w:t>
       </w:r>
     </w:p>
     <w:p/>

</xml_diff>

<commit_message>
Add questions for Aerosmart section
</commit_message>
<xml_diff>
--- a/BBA_Aerosmart_Proposal.docx
+++ b/BBA_Aerosmart_Proposal.docx
@@ -832,6 +832,58 @@
       </w:r>
     </w:p>
     <w:p/>
+    <w:p>
+      <w:pPr>
+        <w:pStyle w:val="Heading1"/>
+      </w:pPr>
+      <w:r>
+        <w:rPr>
+          <w:color w:val="1A1A1A"/>
+        </w:rPr>
+        <w:t>Questions for Aerosmart</w:t>
+      </w:r>
+    </w:p>
+    <w:p>
+      <w:r>
+        <w:t>1. What is the exact GPU configuration of the Dell Pro Max Tower T2?</w:t>
+      </w:r>
+    </w:p>
+    <w:p>
+      <w:r>
+        <w:t>2. Which Flight Hub 2 version is deployed — Cloud, On-Premises, or AIO?</w:t>
+      </w:r>
+    </w:p>
+    <w:p>
+      <w:r>
+        <w:t>3. Can you provide Flight Hub 2 Cloud Algorithm API documentation and access credentials?</w:t>
+      </w:r>
+    </w:p>
+    <w:p>
+      <w:r>
+        <w:t>4. What are the Dock 3 camera specifications (resolution, FoV, lens type)?</w:t>
+      </w:r>
+    </w:p>
+    <w:p>
+      <w:r>
+        <w:t>5. Are there any fixed cameras already installed on-site, or is this drone-only?</w:t>
+      </w:r>
+    </w:p>
+    <w:p>
+      <w:r>
+        <w:t>6. Can sample flight footage (video/photos) from the actual sites be provided for testing?</w:t>
+      </w:r>
+    </w:p>
+    <w:p>
+      <w:r>
+        <w:t>7. Which use cases are highest priority for Aerosmart?</w:t>
+      </w:r>
+    </w:p>
+    <w:p>
+      <w:r>
+        <w:t>8. Is remote access (SSH) to the Dell T2 possible during development?</w:t>
+      </w:r>
+    </w:p>
+    <w:p/>
     <w:p/>
     <w:p>
       <w:pPr>

</xml_diff>